<commit_message>
[Documentation] Update HW2 submission document and add PDF export
</commit_message>
<xml_diff>
--- a/hw/hw2/113598009_2.docx
+++ b/hw/hw2/113598009_2.docx
@@ -13103,12 +13103,12 @@
           <w:p>
             <w:pPr>
               <w:rPr>
-                <w:rFonts w:eastAsia="標楷體"/>
-              </w:rPr>
-            </w:pPr>
-            <w:r>
-              <w:rPr>
-                <w:rFonts w:eastAsia="標楷體"/>
+                <w:rFonts w:eastAsia="標楷體" w:hint="eastAsia"/>
+              </w:rPr>
+            </w:pPr>
+            <w:r>
+              <w:rPr>
+                <w:rFonts w:eastAsia="標楷體" w:hint="eastAsia"/>
               </w:rPr>
               <w:t>113598009</w:t>
             </w:r>
@@ -13138,7 +13138,7 @@
             </w:pPr>
             <w:r>
               <w:rPr>
-                <w:rFonts w:eastAsia="標楷體"/>
+                <w:rFonts w:eastAsia="標楷體" w:hint="eastAsia"/>
               </w:rPr>
               <w:t>李俊威</w:t>
             </w:r>
@@ -13163,6 +13163,158 @@
           <w:p>
             <w:pPr>
               <w:rPr>
+                <w:rFonts w:eastAsia="標楷體" w:hint="eastAsia"/>
+              </w:rPr>
+            </w:pPr>
+            <w:r>
+              <w:rPr>
+                <w:rFonts w:eastAsia="標楷體" w:hint="eastAsia"/>
+              </w:rPr>
+              <w:t>HW#1</w:t>
+            </w:r>
+          </w:p>
+        </w:tc>
+        <w:tc>
+          <w:tcPr>
+            <w:tcW w:w="2526" w:type="dxa"/>
+            <w:tcBorders>
+              <w:top w:val="single" w:sz="1" w:space="0" w:color="AAAAAA"/>
+              <w:left w:val="single" w:sz="1" w:space="0" w:color="AAAAAA"/>
+              <w:bottom w:val="single" w:sz="1" w:space="0" w:color="AAAAAA"/>
+              <w:right w:val="single" w:sz="1" w:space="0" w:color="AAAAAA"/>
+            </w:tcBorders>
+            <w:tcMar>
+              <w:top w:w="80" w:type="dxa"/>
+              <w:left w:w="120" w:type="dxa"/>
+              <w:bottom w:w="80" w:type="dxa"/>
+              <w:right w:w="120" w:type="dxa"/>
+            </w:tcMar>
+          </w:tcPr>
+          <w:p>
+            <w:pPr>
+              <w:rPr>
+                <w:rFonts w:eastAsia="標楷體" w:hint="eastAsia"/>
+              </w:rPr>
+            </w:pPr>
+            <w:r>
+              <w:rPr>
+                <w:rFonts w:eastAsia="標楷體" w:hint="eastAsia"/>
+              </w:rPr>
+              <w:t>115/03/03 15:00 ~ 18:00</w:t>
+            </w:r>
+          </w:p>
+        </w:tc>
+        <w:tc>
+          <w:tcPr>
+            <w:tcW w:w="2000" w:type="dxa"/>
+            <w:tcBorders>
+              <w:top w:val="single" w:sz="1" w:space="0" w:color="AAAAAA"/>
+              <w:left w:val="single" w:sz="1" w:space="0" w:color="AAAAAA"/>
+              <w:bottom w:val="single" w:sz="1" w:space="0" w:color="AAAAAA"/>
+              <w:right w:val="single" w:sz="1" w:space="0" w:color="AAAAAA"/>
+            </w:tcBorders>
+            <w:tcMar>
+              <w:top w:w="80" w:type="dxa"/>
+              <w:left w:w="120" w:type="dxa"/>
+              <w:bottom w:w="80" w:type="dxa"/>
+              <w:right w:w="120" w:type="dxa"/>
+            </w:tcMar>
+          </w:tcPr>
+          <w:p>
+            <w:pPr>
+              <w:rPr>
+                <w:rFonts w:eastAsia="標楷體" w:hint="eastAsia"/>
+              </w:rPr>
+            </w:pPr>
+            <w:r>
+              <w:rPr>
+                <w:rFonts w:eastAsia="標楷體" w:hint="eastAsia"/>
+              </w:rPr>
+              <w:t>3H</w:t>
+            </w:r>
+          </w:p>
+        </w:tc>
+      </w:tr>
+      <w:tr>
+        <w:tc>
+          <w:tcPr>
+            <w:tcW w:w="1800" w:type="dxa"/>
+            <w:tcBorders>
+              <w:top w:val="single" w:sz="1" w:space="0" w:color="AAAAAA"/>
+              <w:left w:val="single" w:sz="1" w:space="0" w:color="AAAAAA"/>
+              <w:bottom w:val="single" w:sz="1" w:space="0" w:color="AAAAAA"/>
+              <w:right w:val="single" w:sz="1" w:space="0" w:color="AAAAAA"/>
+            </w:tcBorders>
+            <w:tcMar>
+              <w:top w:w="80" w:type="dxa"/>
+              <w:left w:w="120" w:type="dxa"/>
+              <w:bottom w:w="80" w:type="dxa"/>
+              <w:right w:w="120" w:type="dxa"/>
+            </w:tcMar>
+          </w:tcPr>
+          <w:p>
+            <w:pPr>
+              <w:rPr>
+                <w:rFonts w:eastAsia="標楷體"/>
+              </w:rPr>
+            </w:pPr>
+            <w:r>
+              <w:rPr>
+                <w:rFonts w:eastAsia="標楷體"/>
+              </w:rPr>
+              <w:t>113598009</w:t>
+            </w:r>
+          </w:p>
+        </w:tc>
+        <w:tc>
+          <w:tcPr>
+            <w:tcW w:w="1500" w:type="dxa"/>
+            <w:tcBorders>
+              <w:top w:val="single" w:sz="1" w:space="0" w:color="AAAAAA"/>
+              <w:left w:val="single" w:sz="1" w:space="0" w:color="AAAAAA"/>
+              <w:bottom w:val="single" w:sz="1" w:space="0" w:color="AAAAAA"/>
+              <w:right w:val="single" w:sz="1" w:space="0" w:color="AAAAAA"/>
+            </w:tcBorders>
+            <w:tcMar>
+              <w:top w:w="80" w:type="dxa"/>
+              <w:left w:w="120" w:type="dxa"/>
+              <w:bottom w:w="80" w:type="dxa"/>
+              <w:right w:w="120" w:type="dxa"/>
+            </w:tcMar>
+          </w:tcPr>
+          <w:p>
+            <w:pPr>
+              <w:rPr>
+                <w:rFonts w:eastAsia="標楷體"/>
+              </w:rPr>
+            </w:pPr>
+            <w:r>
+              <w:rPr>
+                <w:rFonts w:eastAsia="標楷體"/>
+              </w:rPr>
+              <w:t>李俊威</w:t>
+            </w:r>
+          </w:p>
+        </w:tc>
+        <w:tc>
+          <w:tcPr>
+            <w:tcW w:w="1200" w:type="dxa"/>
+            <w:tcBorders>
+              <w:top w:val="single" w:sz="1" w:space="0" w:color="AAAAAA"/>
+              <w:left w:val="single" w:sz="1" w:space="0" w:color="AAAAAA"/>
+              <w:bottom w:val="single" w:sz="1" w:space="0" w:color="AAAAAA"/>
+              <w:right w:val="single" w:sz="1" w:space="0" w:color="AAAAAA"/>
+            </w:tcBorders>
+            <w:tcMar>
+              <w:top w:w="80" w:type="dxa"/>
+              <w:left w:w="120" w:type="dxa"/>
+              <w:bottom w:w="80" w:type="dxa"/>
+              <w:right w:w="120" w:type="dxa"/>
+            </w:tcMar>
+          </w:tcPr>
+          <w:p>
+            <w:pPr>
+              <w:rPr>
                 <w:rFonts w:eastAsia="標楷體"/>
               </w:rPr>
             </w:pPr>
@@ -13193,20 +13345,44 @@
           <w:p>
             <w:pPr>
               <w:rPr>
+                <w:rFonts w:eastAsia="標楷體"/>
+              </w:rPr>
+            </w:pPr>
+            <w:r>
+              <w:rPr>
+                <w:rFonts w:eastAsia="標楷體"/>
+              </w:rPr>
+              <w:t xml:space="preserve">115/03/12  </w:t>
+            </w:r>
+            <w:r>
+              <w:rPr>
                 <w:rFonts w:eastAsia="標楷體" w:hint="eastAsia"/>
               </w:rPr>
-            </w:pPr>
-            <w:r>
-              <w:rPr>
-                <w:rFonts w:eastAsia="標楷體"/>
-              </w:rPr>
-              <w:t xml:space="preserve">115/03/12  </w:t>
+              <w:t>15</w:t>
+            </w:r>
+            <w:r>
+              <w:rPr>
+                <w:rFonts w:eastAsia="標楷體"/>
+              </w:rPr>
+              <w:t>:</w:t>
             </w:r>
             <w:r>
               <w:rPr>
                 <w:rFonts w:eastAsia="標楷體" w:hint="eastAsia"/>
               </w:rPr>
-              <w:t>15</w:t>
+              <w:t>00</w:t>
+            </w:r>
+            <w:r>
+              <w:rPr>
+                <w:rFonts w:eastAsia="標楷體"/>
+              </w:rPr>
+              <w:t xml:space="preserve"> ~ </w:t>
+            </w:r>
+            <w:r>
+              <w:rPr>
+                <w:rFonts w:eastAsia="標楷體" w:hint="eastAsia"/>
+              </w:rPr>
+              <w:t>21</w:t>
             </w:r>
             <w:r>
               <w:rPr>
@@ -13220,59 +13396,41 @@
               </w:rPr>
               <w:t>00</w:t>
             </w:r>
-            <w:r>
-              <w:rPr>
-                <w:rFonts w:eastAsia="標楷體"/>
-              </w:rPr>
-              <w:t xml:space="preserve"> ~ </w:t>
-            </w:r>
+          </w:p>
+        </w:tc>
+        <w:tc>
+          <w:tcPr>
+            <w:tcW w:w="2000" w:type="dxa"/>
+            <w:tcBorders>
+              <w:top w:val="single" w:sz="1" w:space="0" w:color="AAAAAA"/>
+              <w:left w:val="single" w:sz="1" w:space="0" w:color="AAAAAA"/>
+              <w:bottom w:val="single" w:sz="1" w:space="0" w:color="AAAAAA"/>
+              <w:right w:val="single" w:sz="1" w:space="0" w:color="AAAAAA"/>
+            </w:tcBorders>
+            <w:tcMar>
+              <w:top w:w="80" w:type="dxa"/>
+              <w:left w:w="120" w:type="dxa"/>
+              <w:bottom w:w="80" w:type="dxa"/>
+              <w:right w:w="120" w:type="dxa"/>
+            </w:tcMar>
+          </w:tcPr>
+          <w:p>
+            <w:pPr>
+              <w:rPr>
+                <w:rFonts w:eastAsia="標楷體"/>
+              </w:rPr>
+            </w:pPr>
             <w:r>
               <w:rPr>
                 <w:rFonts w:eastAsia="標楷體" w:hint="eastAsia"/>
               </w:rPr>
-              <w:t>21</w:t>
-            </w:r>
-            <w:r>
-              <w:rPr>
-                <w:rFonts w:eastAsia="標楷體"/>
-              </w:rPr>
-              <w:t>:</w:t>
+              <w:t xml:space="preserve">6 </w:t>
             </w:r>
             <w:r>
               <w:rPr>
                 <w:rFonts w:eastAsia="標楷體" w:hint="eastAsia"/>
               </w:rPr>
-              <w:t>00</w:t>
-            </w:r>
-          </w:p>
-        </w:tc>
-        <w:tc>
-          <w:tcPr>
-            <w:tcW w:w="2000" w:type="dxa"/>
-            <w:tcBorders>
-              <w:top w:val="single" w:sz="1" w:space="0" w:color="AAAAAA"/>
-              <w:left w:val="single" w:sz="1" w:space="0" w:color="AAAAAA"/>
-              <w:bottom w:val="single" w:sz="1" w:space="0" w:color="AAAAAA"/>
-              <w:right w:val="single" w:sz="1" w:space="0" w:color="AAAAAA"/>
-            </w:tcBorders>
-            <w:tcMar>
-              <w:top w:w="80" w:type="dxa"/>
-              <w:left w:w="120" w:type="dxa"/>
-              <w:bottom w:w="80" w:type="dxa"/>
-              <w:right w:w="120" w:type="dxa"/>
-            </w:tcMar>
-          </w:tcPr>
-          <w:p>
-            <w:pPr>
-              <w:rPr>
-                <w:rFonts w:eastAsia="標楷體"/>
-              </w:rPr>
-            </w:pPr>
-            <w:r>
-              <w:rPr>
-                <w:rFonts w:eastAsia="標楷體" w:hint="eastAsia"/>
-              </w:rPr>
-              <w:t>6 hrs</w:t>
+              <w:t>H</w:t>
             </w:r>
           </w:p>
         </w:tc>

</xml_diff>

<commit_message>
[Documentation] Fix HW2 submission issues and update Use Case Diagram
- UC-02: Remove Step 3 (external editor action outside system boundary);
  renumber Main Success Scenario steps and Extensions accordingly
- NFR-04: Rewrite from design principle (OCP) to requirement-oriented
  description; remove class name references (ArchChecker, StyleProfile)
- NFR-06: Rewrite from design constraint to requirement-oriented
  description; remove implementation detail (I/O mock)
- Sync NFR-04/06 descriptions in UC-02 and UC-03 Special Requirements
- UseCaseDiagram: Add UC-03 <<include>> UC-05 relationship
- UseCaseDiagram.drawio.png: Re-export updated diagram
- hw/plan/hw1-implementation-plan.md: Add UC-03/UC-04 concrete scenario examples
</commit_message>
<xml_diff>
--- a/hw/hw2/113598009_2.docx
+++ b/hw/hw2/113598009_2.docx
@@ -816,8 +816,16 @@
         <w:rPr>
           <w:rFonts w:eastAsia="標楷體"/>
         </w:rPr>
-        <w:t xml:space="preserve"> ArchUnit</w:t>
+        <w:t xml:space="preserve"> </w:t>
       </w:r>
+      <w:proofErr w:type="spellStart"/>
+      <w:r>
+        <w:rPr>
+          <w:rFonts w:eastAsia="標楷體"/>
+        </w:rPr>
+        <w:t>ArchUnit</w:t>
+      </w:r>
+      <w:proofErr w:type="spellEnd"/>
       <w:r>
         <w:rPr>
           <w:rFonts w:eastAsia="標楷體"/>
@@ -965,29 +973,6 @@
     </w:p>
     <w:p>
       <w:pPr>
-        <w:widowControl/>
-        <w:rPr>
-          <w:rFonts w:eastAsia="標楷體"/>
-        </w:rPr>
-      </w:pPr>
-      <w:r>
-        <w:rPr>
-          <w:rFonts w:eastAsia="標楷體"/>
-        </w:rPr>
-        <w:br w:type="page"/>
-      </w:r>
-    </w:p>
-    <w:p>
-      <w:pPr>
-        <w:spacing w:after="240"/>
-        <w:ind w:firstLine="480"/>
-        <w:rPr>
-          <w:rFonts w:eastAsia="標楷體"/>
-        </w:rPr>
-      </w:pPr>
-    </w:p>
-    <w:p>
-      <w:pPr>
         <w:spacing w:before="240" w:after="120"/>
         <w:rPr>
           <w:rFonts w:eastAsia="標楷體"/>
@@ -1001,6 +986,7 @@
           <w:sz w:val="28"/>
           <w:szCs w:val="28"/>
         </w:rPr>
+        <w:lastRenderedPageBreak/>
         <w:t>2.3 Summary of System Features</w:t>
       </w:r>
     </w:p>
@@ -1445,48 +1431,56 @@
               </w:rPr>
               <w:t>格式定義任意架構風格規則（</w:t>
             </w:r>
+            <w:proofErr w:type="spellStart"/>
             <w:r>
               <w:rPr>
                 <w:rFonts w:eastAsia="標楷體"/>
               </w:rPr>
               <w:t>DependencyRule</w:t>
             </w:r>
+            <w:proofErr w:type="spellEnd"/>
             <w:r>
               <w:rPr>
                 <w:rFonts w:eastAsia="標楷體"/>
               </w:rPr>
               <w:t>、</w:t>
             </w:r>
+            <w:proofErr w:type="spellStart"/>
             <w:r>
               <w:rPr>
                 <w:rFonts w:eastAsia="標楷體"/>
               </w:rPr>
               <w:t>NamingRule</w:t>
             </w:r>
+            <w:proofErr w:type="spellEnd"/>
             <w:r>
               <w:rPr>
                 <w:rFonts w:eastAsia="標楷體"/>
               </w:rPr>
               <w:t>、</w:t>
             </w:r>
+            <w:proofErr w:type="spellStart"/>
             <w:r>
               <w:rPr>
                 <w:rFonts w:eastAsia="標楷體"/>
               </w:rPr>
               <w:t>SupertypeRule</w:t>
             </w:r>
+            <w:proofErr w:type="spellEnd"/>
             <w:r>
               <w:rPr>
                 <w:rFonts w:eastAsia="標楷體"/>
               </w:rPr>
               <w:t>、</w:t>
             </w:r>
+            <w:proofErr w:type="spellStart"/>
             <w:r>
               <w:rPr>
                 <w:rFonts w:eastAsia="標楷體"/>
               </w:rPr>
               <w:t>PackageRule</w:t>
             </w:r>
+            <w:proofErr w:type="spellEnd"/>
             <w:r>
               <w:rPr>
                 <w:rFonts w:eastAsia="標楷體"/>
@@ -1934,10 +1928,10 @@
           <w:noProof/>
         </w:rPr>
         <w:drawing>
-          <wp:inline distT="0" distB="0" distL="0" distR="0" wp14:anchorId="5EE3C74E" wp14:editId="6361E429">
-            <wp:extent cx="5029200" cy="3121843"/>
+          <wp:inline distT="0" distB="0" distL="0" distR="0">
+            <wp:extent cx="5731510" cy="3557270"/>
             <wp:effectExtent l="0" t="0" r="0" b="0"/>
-            <wp:docPr id="1" name="UseCaseDiagram" descr="Use Case Diagram"/>
+            <wp:docPr id="1473456420" name="圖片 1"/>
             <wp:cNvGraphicFramePr>
               <a:graphicFrameLocks xmlns:a="http://schemas.openxmlformats.org/drawingml/2006/main" noChangeAspect="1"/>
             </wp:cNvGraphicFramePr>
@@ -1945,11 +1939,17 @@
               <a:graphicData uri="http://schemas.openxmlformats.org/drawingml/2006/picture">
                 <pic:pic xmlns:pic="http://schemas.openxmlformats.org/drawingml/2006/picture">
                   <pic:nvPicPr>
-                    <pic:cNvPr id="1" name="UseCaseDiagram"/>
+                    <pic:cNvPr id="1473456420" name="圖片 1473456420"/>
                     <pic:cNvPicPr/>
                   </pic:nvPicPr>
                   <pic:blipFill>
-                    <a:blip r:embed="rId5"/>
+                    <a:blip r:embed="rId5">
+                      <a:extLst>
+                        <a:ext uri="{28A0092B-C50C-407E-A947-70E740481C1C}">
+                          <a14:useLocalDpi xmlns:a14="http://schemas.microsoft.com/office/drawing/2010/main" val="0"/>
+                        </a:ext>
+                      </a:extLst>
+                    </a:blip>
                     <a:stretch>
                       <a:fillRect/>
                     </a:stretch>
@@ -1957,7 +1957,7 @@
                   <pic:spPr>
                     <a:xfrm>
                       <a:off x="0" y="0"/>
-                      <a:ext cx="5029200" cy="3121843"/>
+                      <a:ext cx="5731510" cy="3557270"/>
                     </a:xfrm>
                     <a:prstGeom prst="rect">
                       <a:avLst/>
@@ -2029,6 +2029,7 @@
         <w:rPr>
           <w:rFonts w:eastAsia="標楷體"/>
         </w:rPr>
+        <w:lastRenderedPageBreak/>
         <w:t xml:space="preserve">  CI System (Secondary)</w:t>
       </w:r>
       <w:r>
@@ -2120,7 +2121,6 @@
                 <w:bCs/>
                 <w:color w:val="FFFFFF"/>
               </w:rPr>
-              <w:lastRenderedPageBreak/>
               <w:t>UC</w:t>
             </w:r>
           </w:p>
@@ -3690,7 +3690,21 @@
               <w:rPr>
                 <w:rFonts w:eastAsia="標楷體"/>
               </w:rPr>
-              <w:t xml:space="preserve">3. &lt;yaml-path&gt; </w:t>
+              <w:t>3. &lt;</w:t>
+            </w:r>
+            <w:proofErr w:type="spellStart"/>
+            <w:r>
+              <w:rPr>
+                <w:rFonts w:eastAsia="標楷體"/>
+              </w:rPr>
+              <w:t>yaml</w:t>
+            </w:r>
+            <w:proofErr w:type="spellEnd"/>
+            <w:r>
+              <w:rPr>
+                <w:rFonts w:eastAsia="標楷體"/>
+              </w:rPr>
+              <w:t xml:space="preserve">-path&gt; </w:t>
             </w:r>
             <w:r>
               <w:rPr>
@@ -3744,6 +3758,7 @@
                 <w:bCs/>
                 <w:color w:val="000000"/>
               </w:rPr>
+              <w:lastRenderedPageBreak/>
               <w:t>Success Guarantee</w:t>
             </w:r>
           </w:p>
@@ -3780,20 +3795,30 @@
               <w:rPr>
                 <w:rFonts w:eastAsia="標楷體"/>
               </w:rPr>
-              <w:t xml:space="preserve"> ViolationReport</w:t>
-            </w:r>
+              <w:t xml:space="preserve"> </w:t>
+            </w:r>
+            <w:proofErr w:type="spellStart"/>
+            <w:r>
+              <w:rPr>
+                <w:rFonts w:eastAsia="標楷體"/>
+              </w:rPr>
+              <w:t>ViolationReport</w:t>
+            </w:r>
+            <w:proofErr w:type="spellEnd"/>
             <w:r>
               <w:rPr>
                 <w:rFonts w:eastAsia="標楷體"/>
               </w:rPr>
               <w:t>，包含：已檢查檔案數、違規清單、</w:t>
             </w:r>
+            <w:proofErr w:type="spellStart"/>
             <w:r>
               <w:rPr>
                 <w:rFonts w:eastAsia="標楷體"/>
               </w:rPr>
               <w:t>suppressedCount</w:t>
             </w:r>
+            <w:proofErr w:type="spellEnd"/>
             <w:r>
               <w:rPr>
                 <w:rFonts w:eastAsia="標楷體"/>
@@ -3912,7 +3937,21 @@
               <w:rPr>
                 <w:rFonts w:eastAsia="標楷體"/>
               </w:rPr>
-              <w:t xml:space="preserve"> arch-checker check --profile &lt;yaml-path&gt; &lt;project-path&gt;</w:t>
+              <w:t xml:space="preserve"> arch-checker check --profile &lt;</w:t>
+            </w:r>
+            <w:proofErr w:type="spellStart"/>
+            <w:r>
+              <w:rPr>
+                <w:rFonts w:eastAsia="標楷體"/>
+              </w:rPr>
+              <w:t>yaml</w:t>
+            </w:r>
+            <w:proofErr w:type="spellEnd"/>
+            <w:r>
+              <w:rPr>
+                <w:rFonts w:eastAsia="標楷體"/>
+              </w:rPr>
+              <w:t>-path&gt; &lt;project-path&gt;</w:t>
             </w:r>
           </w:p>
           <w:p>
@@ -3958,7 +3997,6 @@
               <w:rPr>
                 <w:rFonts w:eastAsia="標楷體"/>
               </w:rPr>
-              <w:lastRenderedPageBreak/>
               <w:t xml:space="preserve">3. </w:t>
             </w:r>
             <w:r>
@@ -3971,7 +4009,21 @@
               <w:rPr>
                 <w:rFonts w:eastAsia="標楷體"/>
               </w:rPr>
-              <w:t xml:space="preserve"> &lt;yaml-path&gt; </w:t>
+              <w:t xml:space="preserve"> &lt;</w:t>
+            </w:r>
+            <w:proofErr w:type="spellStart"/>
+            <w:r>
+              <w:rPr>
+                <w:rFonts w:eastAsia="標楷體"/>
+              </w:rPr>
+              <w:t>yaml</w:t>
+            </w:r>
+            <w:proofErr w:type="spellEnd"/>
+            <w:r>
+              <w:rPr>
+                <w:rFonts w:eastAsia="標楷體"/>
+              </w:rPr>
+              <w:t xml:space="preserve">-path&gt; </w:t>
             </w:r>
             <w:r>
               <w:rPr>
@@ -4059,7 +4111,21 @@
               <w:rPr>
                 <w:rFonts w:eastAsia="標楷體"/>
               </w:rPr>
-              <w:t xml:space="preserve"> JavaParser </w:t>
+              <w:t xml:space="preserve"> </w:t>
+            </w:r>
+            <w:proofErr w:type="spellStart"/>
+            <w:r>
+              <w:rPr>
+                <w:rFonts w:eastAsia="標楷體"/>
+              </w:rPr>
+              <w:t>JavaParser</w:t>
+            </w:r>
+            <w:proofErr w:type="spellEnd"/>
+            <w:r>
+              <w:rPr>
+                <w:rFonts w:eastAsia="標楷體"/>
+              </w:rPr>
+              <w:t xml:space="preserve"> </w:t>
             </w:r>
             <w:r>
               <w:rPr>
@@ -4091,12 +4157,14 @@
               </w:rPr>
               <w:t>（</w:t>
             </w:r>
+            <w:proofErr w:type="spellStart"/>
             <w:r>
               <w:rPr>
                 <w:rFonts w:eastAsia="標楷體"/>
               </w:rPr>
               <w:t>CompilationUnit</w:t>
             </w:r>
+            <w:proofErr w:type="spellEnd"/>
             <w:r>
               <w:rPr>
                 <w:rFonts w:eastAsia="標楷體"/>
@@ -4127,7 +4195,21 @@
               <w:rPr>
                 <w:rFonts w:eastAsia="標楷體"/>
               </w:rPr>
-              <w:t xml:space="preserve"> CompilationUnit </w:t>
+              <w:t xml:space="preserve"> </w:t>
+            </w:r>
+            <w:proofErr w:type="spellStart"/>
+            <w:r>
+              <w:rPr>
+                <w:rFonts w:eastAsia="標楷體"/>
+              </w:rPr>
+              <w:t>CompilationUnit</w:t>
+            </w:r>
+            <w:proofErr w:type="spellEnd"/>
+            <w:r>
+              <w:rPr>
+                <w:rFonts w:eastAsia="標楷體"/>
+              </w:rPr>
+              <w:t xml:space="preserve"> </w:t>
             </w:r>
             <w:r>
               <w:rPr>
@@ -4151,7 +4233,21 @@
               <w:rPr>
                 <w:rFonts w:eastAsia="標楷體"/>
               </w:rPr>
-              <w:t xml:space="preserve"> ArchitectureConstraint </w:t>
+              <w:t xml:space="preserve"> </w:t>
+            </w:r>
+            <w:proofErr w:type="spellStart"/>
+            <w:r>
+              <w:rPr>
+                <w:rFonts w:eastAsia="標楷體"/>
+              </w:rPr>
+              <w:t>ArchitectureConstraint</w:t>
+            </w:r>
+            <w:proofErr w:type="spellEnd"/>
+            <w:r>
+              <w:rPr>
+                <w:rFonts w:eastAsia="標楷體"/>
+              </w:rPr>
+              <w:t xml:space="preserve"> </w:t>
             </w:r>
             <w:r>
               <w:rPr>
@@ -4277,8 +4373,16 @@
               <w:rPr>
                 <w:rFonts w:eastAsia="標楷體"/>
               </w:rPr>
-              <w:t xml:space="preserve"> ViolationReport</w:t>
-            </w:r>
+              <w:t xml:space="preserve"> </w:t>
+            </w:r>
+            <w:proofErr w:type="spellStart"/>
+            <w:r>
+              <w:rPr>
+                <w:rFonts w:eastAsia="標楷體"/>
+              </w:rPr>
+              <w:t>ViolationReport</w:t>
+            </w:r>
+            <w:proofErr w:type="spellEnd"/>
             <w:r>
               <w:rPr>
                 <w:rFonts w:eastAsia="標楷體"/>
@@ -4381,50 +4485,397 @@
                 <w:bCs/>
                 <w:color w:val="000000"/>
               </w:rPr>
+              <w:t>Extensions</w:t>
+            </w:r>
+          </w:p>
+        </w:tc>
+        <w:tc>
+          <w:tcPr>
+            <w:tcW w:w="6726" w:type="dxa"/>
+            <w:tcBorders>
+              <w:top w:val="single" w:sz="1" w:space="0" w:color="AAAAAA"/>
+              <w:left w:val="single" w:sz="1" w:space="0" w:color="AAAAAA"/>
+              <w:bottom w:val="single" w:sz="1" w:space="0" w:color="AAAAAA"/>
+              <w:right w:val="single" w:sz="1" w:space="0" w:color="AAAAAA"/>
+            </w:tcBorders>
+            <w:tcMar>
+              <w:top w:w="80" w:type="dxa"/>
+              <w:left w:w="120" w:type="dxa"/>
+              <w:bottom w:w="80" w:type="dxa"/>
+              <w:right w:w="120" w:type="dxa"/>
+            </w:tcMar>
+          </w:tcPr>
+          <w:p>
+            <w:pPr>
+              <w:rPr>
+                <w:rFonts w:eastAsia="標楷體"/>
+              </w:rPr>
+            </w:pPr>
+            <w:r>
+              <w:rPr>
+                <w:rFonts w:eastAsia="標楷體"/>
+              </w:rPr>
+              <w:t xml:space="preserve">2a. project-path </w:t>
+            </w:r>
+            <w:r>
+              <w:rPr>
+                <w:rFonts w:eastAsia="標楷體"/>
+              </w:rPr>
+              <w:t>不存在：系統輸出</w:t>
+            </w:r>
+            <w:r>
+              <w:rPr>
+                <w:rFonts w:eastAsia="標楷體"/>
+              </w:rPr>
+              <w:t xml:space="preserve"> Error: path not found &lt;path&gt;</w:t>
+            </w:r>
+            <w:r>
+              <w:rPr>
+                <w:rFonts w:eastAsia="標楷體"/>
+              </w:rPr>
+              <w:t>，</w:t>
+            </w:r>
+            <w:r>
+              <w:rPr>
+                <w:rFonts w:eastAsia="標楷體"/>
+              </w:rPr>
+              <w:t>exit code 2</w:t>
+            </w:r>
+            <w:r>
+              <w:rPr>
+                <w:rFonts w:eastAsia="標楷體"/>
+              </w:rPr>
+              <w:t>，終止</w:t>
+            </w:r>
+          </w:p>
+          <w:p>
+            <w:pPr>
+              <w:spacing w:before="40"/>
+              <w:rPr>
+                <w:rFonts w:eastAsia="標楷體"/>
+              </w:rPr>
+            </w:pPr>
+            <w:r>
+              <w:rPr>
+                <w:rFonts w:eastAsia="標楷體"/>
+              </w:rPr>
+              <w:t>3a. &lt;</w:t>
+            </w:r>
+            <w:proofErr w:type="spellStart"/>
+            <w:r>
+              <w:rPr>
+                <w:rFonts w:eastAsia="標楷體"/>
+              </w:rPr>
+              <w:t>yaml</w:t>
+            </w:r>
+            <w:proofErr w:type="spellEnd"/>
+            <w:r>
+              <w:rPr>
+                <w:rFonts w:eastAsia="標楷體"/>
+              </w:rPr>
+              <w:t xml:space="preserve">-path&gt; </w:t>
+            </w:r>
+            <w:r>
+              <w:rPr>
+                <w:rFonts w:eastAsia="標楷體"/>
+              </w:rPr>
+              <w:t>不存在：系統輸出</w:t>
+            </w:r>
+            <w:r>
+              <w:rPr>
+                <w:rFonts w:eastAsia="標楷體"/>
+              </w:rPr>
+              <w:t xml:space="preserve"> Error: profile file not found &lt;path&gt;</w:t>
+            </w:r>
+            <w:r>
+              <w:rPr>
+                <w:rFonts w:eastAsia="標楷體"/>
+              </w:rPr>
+              <w:t>，</w:t>
+            </w:r>
+            <w:r>
+              <w:rPr>
+                <w:rFonts w:eastAsia="標楷體"/>
+              </w:rPr>
+              <w:t>exit code 2</w:t>
+            </w:r>
+            <w:r>
+              <w:rPr>
+                <w:rFonts w:eastAsia="標楷體"/>
+              </w:rPr>
+              <w:t>，終止</w:t>
+            </w:r>
+          </w:p>
+          <w:p>
+            <w:pPr>
+              <w:spacing w:before="40"/>
+              <w:rPr>
+                <w:rFonts w:eastAsia="標楷體"/>
+              </w:rPr>
+            </w:pPr>
+            <w:r>
+              <w:rPr>
+                <w:rFonts w:eastAsia="標楷體"/>
+              </w:rPr>
+              <w:t xml:space="preserve">3b. YAML </w:t>
+            </w:r>
+            <w:r>
+              <w:rPr>
+                <w:rFonts w:eastAsia="標楷體"/>
+              </w:rPr>
+              <w:t>語法錯誤：系統輸出</w:t>
+            </w:r>
+            <w:r>
+              <w:rPr>
+                <w:rFonts w:eastAsia="標楷體"/>
+              </w:rPr>
+              <w:t xml:space="preserve"> YAML </w:t>
+            </w:r>
+            <w:r>
+              <w:rPr>
+                <w:rFonts w:eastAsia="標楷體"/>
+              </w:rPr>
+              <w:t>解析錯誤與行號，</w:t>
+            </w:r>
+            <w:r>
+              <w:rPr>
+                <w:rFonts w:eastAsia="標楷體"/>
+              </w:rPr>
+              <w:t>exit code 2</w:t>
+            </w:r>
+            <w:r>
+              <w:rPr>
+                <w:rFonts w:eastAsia="標楷體"/>
+              </w:rPr>
+              <w:t>，終止</w:t>
+            </w:r>
+          </w:p>
+          <w:p>
+            <w:pPr>
+              <w:spacing w:before="40"/>
+              <w:rPr>
+                <w:rFonts w:eastAsia="標楷體"/>
+              </w:rPr>
+            </w:pPr>
+            <w:r>
+              <w:rPr>
+                <w:rFonts w:eastAsia="標楷體"/>
+              </w:rPr>
+              <w:t xml:space="preserve">3c. YAML </w:t>
+            </w:r>
+            <w:r>
+              <w:rPr>
+                <w:rFonts w:eastAsia="標楷體"/>
+              </w:rPr>
+              <w:t>語法正確但規則定義無效（如未知的</w:t>
+            </w:r>
+            <w:r>
+              <w:rPr>
+                <w:rFonts w:eastAsia="標楷體"/>
+              </w:rPr>
+              <w:t xml:space="preserve"> rule type</w:t>
+            </w:r>
+            <w:r>
+              <w:rPr>
+                <w:rFonts w:eastAsia="標楷體"/>
+              </w:rPr>
+              <w:t>）：系統輸出</w:t>
+            </w:r>
+            <w:r>
+              <w:rPr>
+                <w:rFonts w:eastAsia="標楷體"/>
+              </w:rPr>
+              <w:t xml:space="preserve"> validation </w:t>
+            </w:r>
+            <w:r>
+              <w:rPr>
+                <w:rFonts w:eastAsia="標楷體"/>
+              </w:rPr>
+              <w:t>錯誤清單，</w:t>
+            </w:r>
+            <w:r>
+              <w:rPr>
+                <w:rFonts w:eastAsia="標楷體"/>
+              </w:rPr>
+              <w:t>exit code 2</w:t>
+            </w:r>
+            <w:r>
+              <w:rPr>
+                <w:rFonts w:eastAsia="標楷體"/>
+              </w:rPr>
+              <w:t>，終止</w:t>
+            </w:r>
+          </w:p>
+          <w:p>
+            <w:pPr>
+              <w:spacing w:before="40"/>
+              <w:rPr>
+                <w:rFonts w:eastAsia="標楷體"/>
+              </w:rPr>
+            </w:pPr>
+            <w:r>
+              <w:rPr>
+                <w:rFonts w:eastAsia="標楷體"/>
+              </w:rPr>
+              <w:t xml:space="preserve">4a. project-path </w:t>
+            </w:r>
+            <w:r>
+              <w:rPr>
+                <w:rFonts w:eastAsia="標楷體"/>
+              </w:rPr>
+              <w:t>下無</w:t>
+            </w:r>
+            <w:r>
+              <w:rPr>
+                <w:rFonts w:eastAsia="標楷體"/>
+              </w:rPr>
+              <w:t xml:space="preserve"> .java </w:t>
+            </w:r>
+            <w:r>
+              <w:rPr>
+                <w:rFonts w:eastAsia="標楷體"/>
+              </w:rPr>
+              <w:t>檔：系統輸出</w:t>
+            </w:r>
+            <w:r>
+              <w:rPr>
+                <w:rFonts w:eastAsia="標楷體"/>
+              </w:rPr>
+              <w:t xml:space="preserve"> Warning: No Java files found in &lt;path&gt;</w:t>
+            </w:r>
+            <w:r>
+              <w:rPr>
+                <w:rFonts w:eastAsia="標楷體"/>
+              </w:rPr>
+              <w:t>，</w:t>
+            </w:r>
+            <w:r>
+              <w:rPr>
+                <w:rFonts w:eastAsia="標楷體"/>
+              </w:rPr>
+              <w:t>exit code 0</w:t>
+            </w:r>
+            <w:r>
+              <w:rPr>
+                <w:rFonts w:eastAsia="標楷體"/>
+              </w:rPr>
+              <w:t>，終止</w:t>
+            </w:r>
+          </w:p>
+          <w:p>
+            <w:pPr>
+              <w:spacing w:before="40"/>
+              <w:rPr>
+                <w:rFonts w:eastAsia="標楷體"/>
+              </w:rPr>
+            </w:pPr>
+            <w:r>
+              <w:rPr>
+                <w:rFonts w:eastAsia="標楷體"/>
+              </w:rPr>
+              <w:t xml:space="preserve">5a. </w:t>
+            </w:r>
+            <w:r>
+              <w:rPr>
+                <w:rFonts w:eastAsia="標楷體"/>
+              </w:rPr>
+              <w:t>某</w:t>
+            </w:r>
+            <w:r>
+              <w:rPr>
+                <w:rFonts w:eastAsia="標楷體"/>
+              </w:rPr>
+              <w:t xml:space="preserve"> .java </w:t>
+            </w:r>
+            <w:r>
+              <w:rPr>
+                <w:rFonts w:eastAsia="標楷體"/>
+              </w:rPr>
+              <w:t>檔語法錯誤無法解析：系統記錄</w:t>
+            </w:r>
+            <w:r>
+              <w:rPr>
+                <w:rFonts w:eastAsia="標楷體"/>
+              </w:rPr>
+              <w:t xml:space="preserve"> Warning: skipped &lt;file&gt; (parse </w:t>
+            </w:r>
+            <w:proofErr w:type="gramStart"/>
+            <w:r>
+              <w:rPr>
+                <w:rFonts w:eastAsia="標楷體"/>
+              </w:rPr>
+              <w:t>error)</w:t>
+            </w:r>
+            <w:r>
+              <w:rPr>
+                <w:rFonts w:eastAsia="標楷體"/>
+              </w:rPr>
+              <w:t>，</w:t>
+            </w:r>
+            <w:proofErr w:type="gramEnd"/>
+            <w:r>
+              <w:rPr>
+                <w:rFonts w:eastAsia="標楷體"/>
+              </w:rPr>
+              <w:t>跳過，繼續處理其餘檔案</w:t>
+            </w:r>
+          </w:p>
+          <w:p>
+            <w:pPr>
+              <w:spacing w:before="40"/>
+              <w:rPr>
+                <w:rFonts w:eastAsia="標楷體"/>
+              </w:rPr>
+            </w:pPr>
+            <w:r>
+              <w:rPr>
+                <w:rFonts w:eastAsia="標楷體"/>
+              </w:rPr>
               <w:lastRenderedPageBreak/>
-              <w:t>Extensions</w:t>
-            </w:r>
-          </w:p>
-        </w:tc>
-        <w:tc>
-          <w:tcPr>
-            <w:tcW w:w="6726" w:type="dxa"/>
-            <w:tcBorders>
-              <w:top w:val="single" w:sz="1" w:space="0" w:color="AAAAAA"/>
-              <w:left w:val="single" w:sz="1" w:space="0" w:color="AAAAAA"/>
-              <w:bottom w:val="single" w:sz="1" w:space="0" w:color="AAAAAA"/>
-              <w:right w:val="single" w:sz="1" w:space="0" w:color="AAAAAA"/>
-            </w:tcBorders>
-            <w:tcMar>
-              <w:top w:w="80" w:type="dxa"/>
-              <w:left w:w="120" w:type="dxa"/>
-              <w:bottom w:w="80" w:type="dxa"/>
-              <w:right w:w="120" w:type="dxa"/>
-            </w:tcMar>
-          </w:tcPr>
-          <w:p>
-            <w:pPr>
-              <w:rPr>
-                <w:rFonts w:eastAsia="標楷體"/>
-              </w:rPr>
-            </w:pPr>
-            <w:r>
-              <w:rPr>
-                <w:rFonts w:eastAsia="標楷體"/>
-              </w:rPr>
-              <w:t xml:space="preserve">2a. project-path </w:t>
-            </w:r>
-            <w:r>
-              <w:rPr>
-                <w:rFonts w:eastAsia="標楷體"/>
-              </w:rPr>
-              <w:t>不存在：系統輸出</w:t>
-            </w:r>
-            <w:r>
-              <w:rPr>
-                <w:rFonts w:eastAsia="標楷體"/>
-              </w:rPr>
-              <w:t xml:space="preserve"> Error: path not found &lt;path&gt;</w:t>
+              <w:t xml:space="preserve">8a. </w:t>
+            </w:r>
+            <w:r>
+              <w:rPr>
+                <w:rFonts w:eastAsia="標楷體"/>
+              </w:rPr>
+              <w:t>所有</w:t>
+            </w:r>
+            <w:r>
+              <w:rPr>
+                <w:rFonts w:eastAsia="標楷體"/>
+              </w:rPr>
+              <w:t xml:space="preserve"> Violation </w:t>
+            </w:r>
+            <w:r>
+              <w:rPr>
+                <w:rFonts w:eastAsia="標楷體"/>
+              </w:rPr>
+              <w:t>皆已被</w:t>
+            </w:r>
+            <w:r>
+              <w:rPr>
+                <w:rFonts w:eastAsia="標楷體"/>
+              </w:rPr>
+              <w:t xml:space="preserve"> suppress</w:t>
+            </w:r>
+            <w:r>
+              <w:rPr>
+                <w:rFonts w:eastAsia="標楷體"/>
+              </w:rPr>
+              <w:t>：報告顯示</w:t>
+            </w:r>
+            <w:r>
+              <w:rPr>
+                <w:rFonts w:eastAsia="標楷體"/>
+              </w:rPr>
+              <w:t xml:space="preserve"> All checks passed (N violations </w:t>
+            </w:r>
+            <w:proofErr w:type="gramStart"/>
+            <w:r>
+              <w:rPr>
+                <w:rFonts w:eastAsia="標楷體"/>
+              </w:rPr>
+              <w:t>suppressed)</w:t>
             </w:r>
             <w:r>
               <w:rPr>
@@ -4432,318 +4883,7 @@
               </w:rPr>
               <w:t>，</w:t>
             </w:r>
-            <w:r>
-              <w:rPr>
-                <w:rFonts w:eastAsia="標楷體"/>
-              </w:rPr>
-              <w:t>exit code 2</w:t>
-            </w:r>
-            <w:r>
-              <w:rPr>
-                <w:rFonts w:eastAsia="標楷體"/>
-              </w:rPr>
-              <w:t>，終止</w:t>
-            </w:r>
-          </w:p>
-          <w:p>
-            <w:pPr>
-              <w:spacing w:before="40"/>
-              <w:rPr>
-                <w:rFonts w:eastAsia="標楷體"/>
-              </w:rPr>
-            </w:pPr>
-            <w:r>
-              <w:rPr>
-                <w:rFonts w:eastAsia="標楷體"/>
-              </w:rPr>
-              <w:t xml:space="preserve">3a. &lt;yaml-path&gt; </w:t>
-            </w:r>
-            <w:r>
-              <w:rPr>
-                <w:rFonts w:eastAsia="標楷體"/>
-              </w:rPr>
-              <w:t>不存在：系統輸出</w:t>
-            </w:r>
-            <w:r>
-              <w:rPr>
-                <w:rFonts w:eastAsia="標楷體"/>
-              </w:rPr>
-              <w:t xml:space="preserve"> Error: profile file not found &lt;path&gt;</w:t>
-            </w:r>
-            <w:r>
-              <w:rPr>
-                <w:rFonts w:eastAsia="標楷體"/>
-              </w:rPr>
-              <w:t>，</w:t>
-            </w:r>
-            <w:r>
-              <w:rPr>
-                <w:rFonts w:eastAsia="標楷體"/>
-              </w:rPr>
-              <w:t>exit code 2</w:t>
-            </w:r>
-            <w:r>
-              <w:rPr>
-                <w:rFonts w:eastAsia="標楷體"/>
-              </w:rPr>
-              <w:t>，終止</w:t>
-            </w:r>
-          </w:p>
-          <w:p>
-            <w:pPr>
-              <w:spacing w:before="40"/>
-              <w:rPr>
-                <w:rFonts w:eastAsia="標楷體"/>
-              </w:rPr>
-            </w:pPr>
-            <w:r>
-              <w:rPr>
-                <w:rFonts w:eastAsia="標楷體"/>
-              </w:rPr>
-              <w:t xml:space="preserve">3b. YAML </w:t>
-            </w:r>
-            <w:r>
-              <w:rPr>
-                <w:rFonts w:eastAsia="標楷體"/>
-              </w:rPr>
-              <w:t>語法錯誤：系統輸出</w:t>
-            </w:r>
-            <w:r>
-              <w:rPr>
-                <w:rFonts w:eastAsia="標楷體"/>
-              </w:rPr>
-              <w:t xml:space="preserve"> YAML </w:t>
-            </w:r>
-            <w:r>
-              <w:rPr>
-                <w:rFonts w:eastAsia="標楷體"/>
-              </w:rPr>
-              <w:t>解析錯誤與行號，</w:t>
-            </w:r>
-            <w:r>
-              <w:rPr>
-                <w:rFonts w:eastAsia="標楷體"/>
-              </w:rPr>
-              <w:t>exit code 2</w:t>
-            </w:r>
-            <w:r>
-              <w:rPr>
-                <w:rFonts w:eastAsia="標楷體"/>
-              </w:rPr>
-              <w:t>，終止</w:t>
-            </w:r>
-          </w:p>
-          <w:p>
-            <w:pPr>
-              <w:spacing w:before="40"/>
-              <w:rPr>
-                <w:rFonts w:eastAsia="標楷體"/>
-              </w:rPr>
-            </w:pPr>
-            <w:r>
-              <w:rPr>
-                <w:rFonts w:eastAsia="標楷體"/>
-              </w:rPr>
-              <w:t xml:space="preserve">3c. YAML </w:t>
-            </w:r>
-            <w:r>
-              <w:rPr>
-                <w:rFonts w:eastAsia="標楷體"/>
-              </w:rPr>
-              <w:t>語法正確但規則定義無效（如未知的</w:t>
-            </w:r>
-            <w:r>
-              <w:rPr>
-                <w:rFonts w:eastAsia="標楷體"/>
-              </w:rPr>
-              <w:t xml:space="preserve"> rule type</w:t>
-            </w:r>
-            <w:r>
-              <w:rPr>
-                <w:rFonts w:eastAsia="標楷體"/>
-              </w:rPr>
-              <w:t>）：系統輸出</w:t>
-            </w:r>
-            <w:r>
-              <w:rPr>
-                <w:rFonts w:eastAsia="標楷體"/>
-              </w:rPr>
-              <w:t xml:space="preserve"> validation </w:t>
-            </w:r>
-            <w:r>
-              <w:rPr>
-                <w:rFonts w:eastAsia="標楷體"/>
-              </w:rPr>
-              <w:t>錯誤清單，</w:t>
-            </w:r>
-            <w:r>
-              <w:rPr>
-                <w:rFonts w:eastAsia="標楷體"/>
-              </w:rPr>
-              <w:t>exit code 2</w:t>
-            </w:r>
-            <w:r>
-              <w:rPr>
-                <w:rFonts w:eastAsia="標楷體"/>
-              </w:rPr>
-              <w:t>，終止</w:t>
-            </w:r>
-          </w:p>
-          <w:p>
-            <w:pPr>
-              <w:spacing w:before="40"/>
-              <w:rPr>
-                <w:rFonts w:eastAsia="標楷體"/>
-              </w:rPr>
-            </w:pPr>
-            <w:r>
-              <w:rPr>
-                <w:rFonts w:eastAsia="標楷體"/>
-              </w:rPr>
-              <w:t xml:space="preserve">4a. project-path </w:t>
-            </w:r>
-            <w:r>
-              <w:rPr>
-                <w:rFonts w:eastAsia="標楷體"/>
-              </w:rPr>
-              <w:t>下無</w:t>
-            </w:r>
-            <w:r>
-              <w:rPr>
-                <w:rFonts w:eastAsia="標楷體"/>
-              </w:rPr>
-              <w:t xml:space="preserve"> .java </w:t>
-            </w:r>
-            <w:r>
-              <w:rPr>
-                <w:rFonts w:eastAsia="標楷體"/>
-              </w:rPr>
-              <w:t>檔：系統輸出</w:t>
-            </w:r>
-            <w:r>
-              <w:rPr>
-                <w:rFonts w:eastAsia="標楷體"/>
-              </w:rPr>
-              <w:t xml:space="preserve"> Warning: No Java files found in &lt;path&gt;</w:t>
-            </w:r>
-            <w:r>
-              <w:rPr>
-                <w:rFonts w:eastAsia="標楷體"/>
-              </w:rPr>
-              <w:t>，</w:t>
-            </w:r>
-            <w:r>
-              <w:rPr>
-                <w:rFonts w:eastAsia="標楷體"/>
-              </w:rPr>
-              <w:t>exit code 0</w:t>
-            </w:r>
-            <w:r>
-              <w:rPr>
-                <w:rFonts w:eastAsia="標楷體"/>
-              </w:rPr>
-              <w:t>，終止</w:t>
-            </w:r>
-          </w:p>
-          <w:p>
-            <w:pPr>
-              <w:spacing w:before="40"/>
-              <w:rPr>
-                <w:rFonts w:eastAsia="標楷體"/>
-              </w:rPr>
-            </w:pPr>
-            <w:r>
-              <w:rPr>
-                <w:rFonts w:eastAsia="標楷體"/>
-              </w:rPr>
-              <w:t xml:space="preserve">5a. </w:t>
-            </w:r>
-            <w:r>
-              <w:rPr>
-                <w:rFonts w:eastAsia="標楷體"/>
-              </w:rPr>
-              <w:t>某</w:t>
-            </w:r>
-            <w:r>
-              <w:rPr>
-                <w:rFonts w:eastAsia="標楷體"/>
-              </w:rPr>
-              <w:t xml:space="preserve"> .java </w:t>
-            </w:r>
-            <w:r>
-              <w:rPr>
-                <w:rFonts w:eastAsia="標楷體"/>
-              </w:rPr>
-              <w:t>檔語法錯誤無法解析：系統記錄</w:t>
-            </w:r>
-            <w:r>
-              <w:rPr>
-                <w:rFonts w:eastAsia="標楷體"/>
-              </w:rPr>
-              <w:t xml:space="preserve"> Warning: skipped &lt;file&gt; (parse error)</w:t>
-            </w:r>
-            <w:r>
-              <w:rPr>
-                <w:rFonts w:eastAsia="標楷體"/>
-              </w:rPr>
-              <w:t>，跳過，繼續處理其餘檔案</w:t>
-            </w:r>
-          </w:p>
-          <w:p>
-            <w:pPr>
-              <w:spacing w:before="40"/>
-              <w:rPr>
-                <w:rFonts w:eastAsia="標楷體"/>
-              </w:rPr>
-            </w:pPr>
-            <w:r>
-              <w:rPr>
-                <w:rFonts w:eastAsia="標楷體"/>
-              </w:rPr>
-              <w:t xml:space="preserve">8a. </w:t>
-            </w:r>
-            <w:r>
-              <w:rPr>
-                <w:rFonts w:eastAsia="標楷體"/>
-              </w:rPr>
-              <w:t>所有</w:t>
-            </w:r>
-            <w:r>
-              <w:rPr>
-                <w:rFonts w:eastAsia="標楷體"/>
-              </w:rPr>
-              <w:t xml:space="preserve"> Violation </w:t>
-            </w:r>
-            <w:r>
-              <w:rPr>
-                <w:rFonts w:eastAsia="標楷體"/>
-              </w:rPr>
-              <w:t>皆已被</w:t>
-            </w:r>
-            <w:r>
-              <w:rPr>
-                <w:rFonts w:eastAsia="標楷體"/>
-              </w:rPr>
-              <w:t xml:space="preserve"> suppress</w:t>
-            </w:r>
-            <w:r>
-              <w:rPr>
-                <w:rFonts w:eastAsia="標楷體"/>
-              </w:rPr>
-              <w:t>：報告顯示</w:t>
-            </w:r>
-            <w:r>
-              <w:rPr>
-                <w:rFonts w:eastAsia="標楷體"/>
-              </w:rPr>
-              <w:t xml:space="preserve"> All checks passed (N violations suppressed)</w:t>
-            </w:r>
-            <w:r>
-              <w:rPr>
-                <w:rFonts w:eastAsia="標楷體"/>
-              </w:rPr>
-              <w:t>，</w:t>
-            </w:r>
+            <w:proofErr w:type="gramEnd"/>
             <w:r>
               <w:rPr>
                 <w:rFonts w:eastAsia="標楷體"/>
@@ -4784,6 +4924,7 @@
                 <w:bCs/>
                 <w:color w:val="000000"/>
               </w:rPr>
+              <w:lastRenderedPageBreak/>
               <w:t>Special Requirements</w:t>
             </w:r>
           </w:p>
@@ -5084,7 +5225,21 @@
               <w:rPr>
                 <w:rFonts w:eastAsia="標楷體"/>
               </w:rPr>
-              <w:t xml:space="preserve"> --format json </w:t>
+              <w:t xml:space="preserve"> --format </w:t>
+            </w:r>
+            <w:proofErr w:type="spellStart"/>
+            <w:r>
+              <w:rPr>
+                <w:rFonts w:eastAsia="標楷體"/>
+              </w:rPr>
+              <w:t>json</w:t>
+            </w:r>
+            <w:proofErr w:type="spellEnd"/>
+            <w:r>
+              <w:rPr>
+                <w:rFonts w:eastAsia="標楷體"/>
+              </w:rPr>
+              <w:t xml:space="preserve"> </w:t>
             </w:r>
             <w:r>
               <w:rPr>
@@ -5254,7 +5409,6 @@
                 <w:bCs/>
                 <w:color w:val="000000"/>
               </w:rPr>
-              <w:lastRenderedPageBreak/>
               <w:t>Miscellaneous</w:t>
             </w:r>
           </w:p>
@@ -5303,7 +5457,21 @@
               <w:rPr>
                 <w:rFonts w:eastAsia="標楷體"/>
               </w:rPr>
-              <w:t xml:space="preserve"> src/main/java </w:t>
+              <w:t xml:space="preserve"> </w:t>
+            </w:r>
+            <w:proofErr w:type="spellStart"/>
+            <w:r>
+              <w:rPr>
+                <w:rFonts w:eastAsia="標楷體"/>
+              </w:rPr>
+              <w:t>src</w:t>
+            </w:r>
+            <w:proofErr w:type="spellEnd"/>
+            <w:r>
+              <w:rPr>
+                <w:rFonts w:eastAsia="標楷體"/>
+              </w:rPr>
+              <w:t xml:space="preserve">/main/java </w:t>
             </w:r>
             <w:r>
               <w:rPr>
@@ -5888,6 +6056,7 @@
                 <w:bCs/>
                 <w:color w:val="000000"/>
               </w:rPr>
+              <w:lastRenderedPageBreak/>
               <w:t>Preconditions</w:t>
             </w:r>
           </w:p>
@@ -6052,7 +6221,21 @@
               <w:rPr>
                 <w:rFonts w:eastAsia="標楷體"/>
               </w:rPr>
-              <w:t xml:space="preserve"> .yaml Profile </w:t>
+              <w:t xml:space="preserve"> .</w:t>
+            </w:r>
+            <w:proofErr w:type="spellStart"/>
+            <w:r>
+              <w:rPr>
+                <w:rFonts w:eastAsia="標楷體"/>
+              </w:rPr>
+              <w:t>yaml</w:t>
+            </w:r>
+            <w:proofErr w:type="spellEnd"/>
+            <w:r>
+              <w:rPr>
+                <w:rFonts w:eastAsia="標楷體"/>
+              </w:rPr>
+              <w:t xml:space="preserve"> Profile </w:t>
             </w:r>
             <w:r>
               <w:rPr>
@@ -6148,7 +6331,35 @@
               <w:rPr>
                 <w:rFonts w:eastAsia="標楷體"/>
               </w:rPr>
-              <w:t xml:space="preserve"> arch-checker init-profile --output &lt;file.yaml&gt;</w:t>
+              <w:t xml:space="preserve"> arch-checker </w:t>
+            </w:r>
+            <w:proofErr w:type="spellStart"/>
+            <w:r>
+              <w:rPr>
+                <w:rFonts w:eastAsia="標楷體"/>
+              </w:rPr>
+              <w:t>init</w:t>
+            </w:r>
+            <w:proofErr w:type="spellEnd"/>
+            <w:r>
+              <w:rPr>
+                <w:rFonts w:eastAsia="標楷體"/>
+              </w:rPr>
+              <w:t>-profile --output &lt;</w:t>
+            </w:r>
+            <w:proofErr w:type="spellStart"/>
+            <w:r>
+              <w:rPr>
+                <w:rFonts w:eastAsia="標楷體"/>
+              </w:rPr>
+              <w:t>file.yaml</w:t>
+            </w:r>
+            <w:proofErr w:type="spellEnd"/>
+            <w:r>
+              <w:rPr>
+                <w:rFonts w:eastAsia="標楷體"/>
+              </w:rPr>
+              <w:t>&gt;</w:t>
             </w:r>
           </w:p>
           <w:p>
@@ -6186,7 +6397,21 @@
               <w:rPr>
                 <w:rFonts w:eastAsia="標楷體"/>
               </w:rPr>
-              <w:t xml:space="preserve"> &lt;file.yaml&gt;</w:t>
+              <w:t xml:space="preserve"> &lt;</w:t>
+            </w:r>
+            <w:proofErr w:type="spellStart"/>
+            <w:r>
+              <w:rPr>
+                <w:rFonts w:eastAsia="標楷體"/>
+              </w:rPr>
+              <w:t>file.yaml</w:t>
+            </w:r>
+            <w:proofErr w:type="spellEnd"/>
+            <w:r>
+              <w:rPr>
+                <w:rFonts w:eastAsia="標楷體"/>
+              </w:rPr>
+              <w:t>&gt;</w:t>
             </w:r>
           </w:p>
           <w:p>
@@ -6206,25 +6431,191 @@
               <w:rPr>
                 <w:rFonts w:eastAsia="標楷體"/>
               </w:rPr>
-              <w:t>以文字編輯器開啟</w:t>
-            </w:r>
-            <w:r>
-              <w:rPr>
-                <w:rFonts w:eastAsia="標楷體"/>
-              </w:rPr>
-              <w:t xml:space="preserve"> &lt;file.yaml&gt;</w:t>
-            </w:r>
-            <w:r>
-              <w:rPr>
-                <w:rFonts w:eastAsia="標楷體"/>
-              </w:rPr>
-              <w:t>，填入規則（</w:t>
-            </w:r>
-            <w:r>
-              <w:rPr>
-                <w:rFonts w:eastAsia="標楷體"/>
-              </w:rPr>
-              <w:t>rule type</w:t>
+              <w:t>執行</w:t>
+            </w:r>
+            <w:r>
+              <w:rPr>
+                <w:rFonts w:eastAsia="標楷體"/>
+              </w:rPr>
+              <w:t xml:space="preserve"> arch-checker validate-profile &lt;</w:t>
+            </w:r>
+            <w:proofErr w:type="spellStart"/>
+            <w:r>
+              <w:rPr>
+                <w:rFonts w:eastAsia="標楷體"/>
+              </w:rPr>
+              <w:t>file.yaml</w:t>
+            </w:r>
+            <w:proofErr w:type="spellEnd"/>
+            <w:r>
+              <w:rPr>
+                <w:rFonts w:eastAsia="標楷體"/>
+              </w:rPr>
+              <w:t xml:space="preserve">&gt; </w:t>
+            </w:r>
+            <w:r>
+              <w:rPr>
+                <w:rFonts w:eastAsia="標楷體"/>
+              </w:rPr>
+              <w:t>驗證語法與規則定義</w:t>
+            </w:r>
+          </w:p>
+          <w:p>
+            <w:pPr>
+              <w:spacing w:before="40"/>
+              <w:rPr>
+                <w:rFonts w:eastAsia="標楷體"/>
+              </w:rPr>
+            </w:pPr>
+            <w:r>
+              <w:rPr>
+                <w:rFonts w:eastAsia="標楷體"/>
+              </w:rPr>
+              <w:t xml:space="preserve">4. </w:t>
+            </w:r>
+            <w:r>
+              <w:rPr>
+                <w:rFonts w:eastAsia="標楷體"/>
+              </w:rPr>
+              <w:t>系統讀取並解析</w:t>
+            </w:r>
+            <w:r>
+              <w:rPr>
+                <w:rFonts w:eastAsia="標楷體"/>
+              </w:rPr>
+              <w:t xml:space="preserve"> YAML </w:t>
+            </w:r>
+            <w:r>
+              <w:rPr>
+                <w:rFonts w:eastAsia="標楷體"/>
+              </w:rPr>
+              <w:t>檔</w:t>
+            </w:r>
+          </w:p>
+          <w:p>
+            <w:pPr>
+              <w:spacing w:before="40"/>
+              <w:rPr>
+                <w:rFonts w:eastAsia="標楷體"/>
+              </w:rPr>
+            </w:pPr>
+            <w:r>
+              <w:rPr>
+                <w:rFonts w:eastAsia="標楷體"/>
+              </w:rPr>
+              <w:t xml:space="preserve">5. </w:t>
+            </w:r>
+            <w:r>
+              <w:rPr>
+                <w:rFonts w:eastAsia="標楷體"/>
+              </w:rPr>
+              <w:t>系統驗證每條規則的</w:t>
+            </w:r>
+            <w:r>
+              <w:rPr>
+                <w:rFonts w:eastAsia="標楷體"/>
+              </w:rPr>
+              <w:t xml:space="preserve"> type</w:t>
+            </w:r>
+            <w:r>
+              <w:rPr>
+                <w:rFonts w:eastAsia="標楷體"/>
+              </w:rPr>
+              <w:t>（</w:t>
+            </w:r>
+            <w:proofErr w:type="spellStart"/>
+            <w:r>
+              <w:rPr>
+                <w:rFonts w:eastAsia="標楷體"/>
+              </w:rPr>
+              <w:t>NamingRule</w:t>
+            </w:r>
+            <w:proofErr w:type="spellEnd"/>
+            <w:r>
+              <w:rPr>
+                <w:rFonts w:eastAsia="標楷體"/>
+              </w:rPr>
+              <w:t xml:space="preserve"> / </w:t>
+            </w:r>
+            <w:proofErr w:type="spellStart"/>
+            <w:r>
+              <w:rPr>
+                <w:rFonts w:eastAsia="標楷體"/>
+              </w:rPr>
+              <w:t>DependencyRule</w:t>
+            </w:r>
+            <w:proofErr w:type="spellEnd"/>
+            <w:r>
+              <w:rPr>
+                <w:rFonts w:eastAsia="標楷體"/>
+              </w:rPr>
+              <w:t xml:space="preserve"> / </w:t>
+            </w:r>
+            <w:proofErr w:type="spellStart"/>
+            <w:r>
+              <w:rPr>
+                <w:rFonts w:eastAsia="標楷體"/>
+              </w:rPr>
+              <w:t>SupertypeRule</w:t>
+            </w:r>
+            <w:proofErr w:type="spellEnd"/>
+            <w:r>
+              <w:rPr>
+                <w:rFonts w:eastAsia="標楷體"/>
+              </w:rPr>
+              <w:t xml:space="preserve"> / </w:t>
+            </w:r>
+            <w:proofErr w:type="spellStart"/>
+            <w:r>
+              <w:rPr>
+                <w:rFonts w:eastAsia="標楷體"/>
+              </w:rPr>
+              <w:t>PackageRule</w:t>
+            </w:r>
+            <w:proofErr w:type="spellEnd"/>
+            <w:r>
+              <w:rPr>
+                <w:rFonts w:eastAsia="標楷體"/>
+              </w:rPr>
+              <w:t>）與所有必填欄位</w:t>
+            </w:r>
+          </w:p>
+          <w:p>
+            <w:pPr>
+              <w:spacing w:before="40"/>
+              <w:rPr>
+                <w:rFonts w:eastAsia="標楷體"/>
+              </w:rPr>
+            </w:pPr>
+            <w:r>
+              <w:rPr>
+                <w:rFonts w:eastAsia="標楷體"/>
+              </w:rPr>
+              <w:t xml:space="preserve">6. </w:t>
+            </w:r>
+            <w:r>
+              <w:rPr>
+                <w:rFonts w:eastAsia="標楷體"/>
+              </w:rPr>
+              <w:t>系統驗證每個</w:t>
+            </w:r>
+            <w:r>
+              <w:rPr>
+                <w:rFonts w:eastAsia="標楷體"/>
+              </w:rPr>
+              <w:t xml:space="preserve"> package pattern </w:t>
+            </w:r>
+            <w:r>
+              <w:rPr>
+                <w:rFonts w:eastAsia="標楷體"/>
+              </w:rPr>
+              <w:t>的語法（只允許英數字、</w:t>
+            </w:r>
+            <w:r>
+              <w:rPr>
+                <w:rFonts w:eastAsia="標楷體"/>
+              </w:rPr>
+              <w:t>*</w:t>
             </w:r>
             <w:r>
               <w:rPr>
@@ -6236,25 +6627,13 @@
               <w:rPr>
                 <w:rFonts w:eastAsia="標楷體"/>
               </w:rPr>
-              <w:t>package pattern</w:t>
-            </w:r>
-            <w:r>
-              <w:rPr>
-                <w:rFonts w:eastAsia="標楷體"/>
-              </w:rPr>
-              <w:t>、</w:t>
-            </w:r>
-            <w:r>
-              <w:rPr>
-                <w:rFonts w:eastAsia="標楷體"/>
-              </w:rPr>
-              <w:t xml:space="preserve">constraint </w:t>
-            </w:r>
-            <w:r>
-              <w:rPr>
-                <w:rFonts w:eastAsia="標楷體"/>
-              </w:rPr>
-              <w:t>細節）</w:t>
+              <w:t>.</w:t>
+            </w:r>
+            <w:r>
+              <w:rPr>
+                <w:rFonts w:eastAsia="標楷體"/>
+              </w:rPr>
+              <w:t>）</w:t>
             </w:r>
           </w:p>
           <w:p>
@@ -6268,25 +6647,19 @@
               <w:rPr>
                 <w:rFonts w:eastAsia="標楷體"/>
               </w:rPr>
-              <w:t xml:space="preserve">4. Developer </w:t>
-            </w:r>
-            <w:r>
-              <w:rPr>
-                <w:rFonts w:eastAsia="標楷體"/>
-              </w:rPr>
-              <w:t>執行</w:t>
-            </w:r>
-            <w:r>
-              <w:rPr>
-                <w:rFonts w:eastAsia="標楷體"/>
-              </w:rPr>
-              <w:t xml:space="preserve"> arch-checker validate-profile &lt;file.yaml&gt; </w:t>
-            </w:r>
-            <w:r>
-              <w:rPr>
-                <w:rFonts w:eastAsia="標楷體"/>
-              </w:rPr>
-              <w:t>驗證語法與規則定義</w:t>
+              <w:t xml:space="preserve">7. </w:t>
+            </w:r>
+            <w:r>
+              <w:rPr>
+                <w:rFonts w:eastAsia="標楷體"/>
+              </w:rPr>
+              <w:t>系統輸出</w:t>
+            </w:r>
+            <w:r>
+              <w:rPr>
+                <w:rFonts w:eastAsia="標楷體"/>
+              </w:rPr>
+              <w:t xml:space="preserve"> Profile valid: &lt;N&gt; rules loaded</w:t>
             </w:r>
           </w:p>
           <w:p>
@@ -6300,165 +6673,7 @@
               <w:rPr>
                 <w:rFonts w:eastAsia="標楷體"/>
               </w:rPr>
-              <w:t xml:space="preserve">5. </w:t>
-            </w:r>
-            <w:r>
-              <w:rPr>
-                <w:rFonts w:eastAsia="標楷體"/>
-              </w:rPr>
-              <w:t>系統讀取並解析</w:t>
-            </w:r>
-            <w:r>
-              <w:rPr>
-                <w:rFonts w:eastAsia="標楷體"/>
-              </w:rPr>
-              <w:t xml:space="preserve"> YAML </w:t>
-            </w:r>
-            <w:r>
-              <w:rPr>
-                <w:rFonts w:eastAsia="標楷體"/>
-              </w:rPr>
-              <w:t>檔</w:t>
-            </w:r>
-          </w:p>
-          <w:p>
-            <w:pPr>
-              <w:spacing w:before="40"/>
-              <w:rPr>
-                <w:rFonts w:eastAsia="標楷體"/>
-              </w:rPr>
-            </w:pPr>
-            <w:r>
-              <w:rPr>
-                <w:rFonts w:eastAsia="標楷體"/>
-              </w:rPr>
-              <w:t xml:space="preserve">6. </w:t>
-            </w:r>
-            <w:r>
-              <w:rPr>
-                <w:rFonts w:eastAsia="標楷體"/>
-              </w:rPr>
-              <w:t>系統驗證每條規則的</w:t>
-            </w:r>
-            <w:r>
-              <w:rPr>
-                <w:rFonts w:eastAsia="標楷體"/>
-              </w:rPr>
-              <w:t xml:space="preserve"> type</w:t>
-            </w:r>
-            <w:r>
-              <w:rPr>
-                <w:rFonts w:eastAsia="標楷體"/>
-              </w:rPr>
-              <w:t>（</w:t>
-            </w:r>
-            <w:r>
-              <w:rPr>
-                <w:rFonts w:eastAsia="標楷體"/>
-              </w:rPr>
-              <w:t>NamingRule / DependencyRule / SupertypeRule / PackageRule</w:t>
-            </w:r>
-            <w:r>
-              <w:rPr>
-                <w:rFonts w:eastAsia="標楷體"/>
-              </w:rPr>
-              <w:t>）與所有必填欄位</w:t>
-            </w:r>
-          </w:p>
-          <w:p>
-            <w:pPr>
-              <w:spacing w:before="40"/>
-              <w:rPr>
-                <w:rFonts w:eastAsia="標楷體"/>
-              </w:rPr>
-            </w:pPr>
-            <w:r>
-              <w:rPr>
-                <w:rFonts w:eastAsia="標楷體"/>
-              </w:rPr>
-              <w:t xml:space="preserve">7. </w:t>
-            </w:r>
-            <w:r>
-              <w:rPr>
-                <w:rFonts w:eastAsia="標楷體"/>
-              </w:rPr>
-              <w:t>系統驗證每個</w:t>
-            </w:r>
-            <w:r>
-              <w:rPr>
-                <w:rFonts w:eastAsia="標楷體"/>
-              </w:rPr>
-              <w:t xml:space="preserve"> package pattern </w:t>
-            </w:r>
-            <w:r>
-              <w:rPr>
-                <w:rFonts w:eastAsia="標楷體"/>
-              </w:rPr>
-              <w:t>的語法（只允許英數字、</w:t>
-            </w:r>
-            <w:r>
-              <w:rPr>
-                <w:rFonts w:eastAsia="標楷體"/>
-              </w:rPr>
-              <w:t>*</w:t>
-            </w:r>
-            <w:r>
-              <w:rPr>
-                <w:rFonts w:eastAsia="標楷體"/>
-              </w:rPr>
-              <w:t>、</w:t>
-            </w:r>
-            <w:r>
-              <w:rPr>
-                <w:rFonts w:eastAsia="標楷體"/>
-              </w:rPr>
-              <w:t>.</w:t>
-            </w:r>
-            <w:r>
-              <w:rPr>
-                <w:rFonts w:eastAsia="標楷體"/>
-              </w:rPr>
-              <w:t>）</w:t>
-            </w:r>
-          </w:p>
-          <w:p>
-            <w:pPr>
-              <w:spacing w:before="40"/>
-              <w:rPr>
-                <w:rFonts w:eastAsia="標楷體"/>
-              </w:rPr>
-            </w:pPr>
-            <w:r>
-              <w:rPr>
-                <w:rFonts w:eastAsia="標楷體"/>
-              </w:rPr>
-              <w:t xml:space="preserve">8. </w:t>
-            </w:r>
-            <w:r>
-              <w:rPr>
-                <w:rFonts w:eastAsia="標楷體"/>
-              </w:rPr>
-              <w:t>系統輸出</w:t>
-            </w:r>
-            <w:r>
-              <w:rPr>
-                <w:rFonts w:eastAsia="標楷體"/>
-              </w:rPr>
-              <w:t xml:space="preserve"> Profile valid: &lt;N&gt; rules loaded</w:t>
-            </w:r>
-          </w:p>
-          <w:p>
-            <w:pPr>
-              <w:spacing w:before="40"/>
-              <w:rPr>
-                <w:rFonts w:eastAsia="標楷體"/>
-              </w:rPr>
-            </w:pPr>
-            <w:r>
-              <w:rPr>
-                <w:rFonts w:eastAsia="標楷體"/>
-              </w:rPr>
-              <w:t xml:space="preserve">9. Developer </w:t>
+              <w:t xml:space="preserve">8. Developer </w:t>
             </w:r>
             <w:r>
               <w:rPr>
@@ -6482,7 +6697,21 @@
               <w:rPr>
                 <w:rFonts w:eastAsia="標楷體"/>
               </w:rPr>
-              <w:t xml:space="preserve"> --profile &lt;file.yaml&gt; </w:t>
+              <w:t xml:space="preserve"> --profile &lt;</w:t>
+            </w:r>
+            <w:proofErr w:type="spellStart"/>
+            <w:r>
+              <w:rPr>
+                <w:rFonts w:eastAsia="標楷體"/>
+              </w:rPr>
+              <w:t>file.yaml</w:t>
+            </w:r>
+            <w:proofErr w:type="spellEnd"/>
+            <w:r>
+              <w:rPr>
+                <w:rFonts w:eastAsia="標楷體"/>
+              </w:rPr>
+              <w:t xml:space="preserve">&gt; </w:t>
             </w:r>
             <w:r>
               <w:rPr>
@@ -6560,7 +6789,7 @@
               <w:rPr>
                 <w:rFonts w:eastAsia="標楷體"/>
               </w:rPr>
-              <w:t xml:space="preserve">4a. Developer </w:t>
+              <w:t xml:space="preserve">3a. Developer </w:t>
             </w:r>
             <w:r>
               <w:rPr>
@@ -6572,7 +6801,21 @@
               <w:rPr>
                 <w:rFonts w:eastAsia="標楷體"/>
               </w:rPr>
-              <w:t xml:space="preserve"> init-profile</w:t>
+              <w:t xml:space="preserve"> </w:t>
+            </w:r>
+            <w:proofErr w:type="spellStart"/>
+            <w:r>
+              <w:rPr>
+                <w:rFonts w:eastAsia="標楷體"/>
+              </w:rPr>
+              <w:t>init</w:t>
+            </w:r>
+            <w:proofErr w:type="spellEnd"/>
+            <w:r>
+              <w:rPr>
+                <w:rFonts w:eastAsia="標楷體"/>
+              </w:rPr>
+              <w:t>-profile</w:t>
             </w:r>
             <w:r>
               <w:rPr>
@@ -6608,7 +6851,7 @@
               <w:rPr>
                 <w:rFonts w:eastAsia="標楷體"/>
               </w:rPr>
-              <w:t xml:space="preserve"> Step 5 </w:t>
+              <w:t xml:space="preserve"> Step 4 </w:t>
             </w:r>
             <w:r>
               <w:rPr>
@@ -6628,184 +6871,256 @@
               <w:rPr>
                 <w:rFonts w:eastAsia="標楷體"/>
               </w:rPr>
+              <w:t>4a. &lt;</w:t>
+            </w:r>
+            <w:proofErr w:type="spellStart"/>
+            <w:proofErr w:type="gramStart"/>
+            <w:r>
+              <w:rPr>
+                <w:rFonts w:eastAsia="標楷體"/>
+              </w:rPr>
+              <w:t>file.yaml</w:t>
+            </w:r>
+            <w:proofErr w:type="spellEnd"/>
+            <w:proofErr w:type="gramEnd"/>
+            <w:r>
+              <w:rPr>
+                <w:rFonts w:eastAsia="標楷體"/>
+              </w:rPr>
+              <w:t xml:space="preserve">&gt; </w:t>
+            </w:r>
+            <w:r>
+              <w:rPr>
+                <w:rFonts w:eastAsia="標楷體"/>
+              </w:rPr>
+              <w:t>不存在：系統輸出</w:t>
+            </w:r>
+            <w:r>
+              <w:rPr>
+                <w:rFonts w:eastAsia="標楷體"/>
+              </w:rPr>
+              <w:t xml:space="preserve"> Error: file not found &lt;path&gt;</w:t>
+            </w:r>
+            <w:r>
+              <w:rPr>
+                <w:rFonts w:eastAsia="標楷體"/>
+              </w:rPr>
+              <w:t>，終止</w:t>
+            </w:r>
+          </w:p>
+          <w:p>
+            <w:pPr>
+              <w:spacing w:before="40"/>
+              <w:rPr>
+                <w:rFonts w:eastAsia="標楷體"/>
+              </w:rPr>
+            </w:pPr>
+            <w:r>
+              <w:rPr>
+                <w:rFonts w:eastAsia="標楷體"/>
+              </w:rPr>
+              <w:t xml:space="preserve">5a. YAML </w:t>
+            </w:r>
+            <w:r>
+              <w:rPr>
+                <w:rFonts w:eastAsia="標楷體"/>
+              </w:rPr>
+              <w:t>頂層結構錯誤（不是合法的</w:t>
+            </w:r>
+            <w:r>
+              <w:rPr>
+                <w:rFonts w:eastAsia="標楷體"/>
+              </w:rPr>
+              <w:t xml:space="preserve"> YAML mapping</w:t>
+            </w:r>
+            <w:r>
+              <w:rPr>
+                <w:rFonts w:eastAsia="標楷體"/>
+              </w:rPr>
+              <w:t>）：系統輸出</w:t>
+            </w:r>
+            <w:r>
+              <w:rPr>
+                <w:rFonts w:eastAsia="標楷體"/>
+              </w:rPr>
+              <w:t xml:space="preserve"> Invalid YAML structure </w:t>
+            </w:r>
+            <w:r>
+              <w:rPr>
+                <w:rFonts w:eastAsia="標楷體"/>
+              </w:rPr>
+              <w:t>與錯誤行號，終止</w:t>
+            </w:r>
+          </w:p>
+          <w:p>
+            <w:pPr>
+              <w:spacing w:before="40"/>
+              <w:rPr>
+                <w:rFonts w:eastAsia="標楷體"/>
+              </w:rPr>
+            </w:pPr>
+            <w:r>
+              <w:rPr>
+                <w:rFonts w:eastAsia="標楷體"/>
+              </w:rPr>
+              <w:t xml:space="preserve">5b. </w:t>
+            </w:r>
+            <w:r>
+              <w:rPr>
+                <w:rFonts w:eastAsia="標楷體"/>
+              </w:rPr>
+              <w:t>遇到未知的</w:t>
+            </w:r>
+            <w:r>
+              <w:rPr>
+                <w:rFonts w:eastAsia="標楷體"/>
+              </w:rPr>
+              <w:t xml:space="preserve"> rule type</w:t>
+            </w:r>
+            <w:r>
+              <w:rPr>
+                <w:rFonts w:eastAsia="標楷體"/>
+              </w:rPr>
+              <w:t>：系統輸出</w:t>
+            </w:r>
+            <w:r>
+              <w:rPr>
+                <w:rFonts w:eastAsia="標楷體"/>
+              </w:rPr>
+              <w:t xml:space="preserve"> Unknown rule type: &lt;type&gt;. Allowed: </w:t>
+            </w:r>
+            <w:proofErr w:type="spellStart"/>
+            <w:r>
+              <w:rPr>
+                <w:rFonts w:eastAsia="標楷體"/>
+              </w:rPr>
+              <w:t>NamingRule</w:t>
+            </w:r>
+            <w:proofErr w:type="spellEnd"/>
+            <w:r>
+              <w:rPr>
+                <w:rFonts w:eastAsia="標楷體"/>
+              </w:rPr>
+              <w:t xml:space="preserve">, </w:t>
+            </w:r>
+            <w:proofErr w:type="spellStart"/>
+            <w:r>
+              <w:rPr>
+                <w:rFonts w:eastAsia="標楷體"/>
+              </w:rPr>
+              <w:t>DependencyRule</w:t>
+            </w:r>
+            <w:proofErr w:type="spellEnd"/>
+            <w:r>
+              <w:rPr>
+                <w:rFonts w:eastAsia="標楷體"/>
+              </w:rPr>
+              <w:t xml:space="preserve">, </w:t>
+            </w:r>
+            <w:proofErr w:type="spellStart"/>
+            <w:r>
+              <w:rPr>
+                <w:rFonts w:eastAsia="標楷體"/>
+              </w:rPr>
+              <w:t>SupertypeRule</w:t>
+            </w:r>
+            <w:proofErr w:type="spellEnd"/>
+            <w:r>
+              <w:rPr>
+                <w:rFonts w:eastAsia="標楷體"/>
+              </w:rPr>
+              <w:t xml:space="preserve">, </w:t>
+            </w:r>
+            <w:proofErr w:type="spellStart"/>
+            <w:r>
+              <w:rPr>
+                <w:rFonts w:eastAsia="標楷體"/>
+              </w:rPr>
+              <w:t>PackageRule</w:t>
+            </w:r>
+            <w:proofErr w:type="spellEnd"/>
+            <w:r>
+              <w:rPr>
+                <w:rFonts w:eastAsia="標楷體"/>
+              </w:rPr>
+              <w:t>，終止</w:t>
+            </w:r>
+          </w:p>
+          <w:p>
+            <w:pPr>
+              <w:spacing w:before="40"/>
+              <w:rPr>
+                <w:rFonts w:eastAsia="標楷體"/>
+              </w:rPr>
+            </w:pPr>
+            <w:r>
+              <w:rPr>
+                <w:rFonts w:eastAsia="標楷體"/>
+              </w:rPr>
+              <w:t xml:space="preserve">6a. package pattern </w:t>
+            </w:r>
+            <w:r>
+              <w:rPr>
+                <w:rFonts w:eastAsia="標楷體"/>
+              </w:rPr>
+              <w:t>含非法字元：系統輸出</w:t>
+            </w:r>
+            <w:r>
+              <w:rPr>
+                <w:rFonts w:eastAsia="標楷體"/>
+              </w:rPr>
+              <w:t xml:space="preserve"> Invalid package pattern: &lt;pattern&gt;</w:t>
+            </w:r>
+            <w:r>
+              <w:rPr>
+                <w:rFonts w:eastAsia="標楷體"/>
+              </w:rPr>
+              <w:t>，終止</w:t>
+            </w:r>
+          </w:p>
+          <w:p>
+            <w:pPr>
+              <w:spacing w:before="40"/>
+              <w:rPr>
+                <w:rFonts w:eastAsia="標楷體"/>
+              </w:rPr>
+            </w:pPr>
+            <w:r>
+              <w:rPr>
+                <w:rFonts w:eastAsia="標楷體"/>
+              </w:rPr>
+              <w:t xml:space="preserve">7a. YAML </w:t>
+            </w:r>
+            <w:r>
+              <w:rPr>
+                <w:rFonts w:eastAsia="標楷體"/>
+              </w:rPr>
+              <w:t>格式正確但</w:t>
+            </w:r>
+            <w:r>
+              <w:rPr>
+                <w:rFonts w:eastAsia="標楷體"/>
+              </w:rPr>
+              <w:t xml:space="preserve"> rules </w:t>
+            </w:r>
+            <w:r>
+              <w:rPr>
+                <w:rFonts w:eastAsia="標楷體"/>
+              </w:rPr>
+              <w:t>清單為空：系統輸出</w:t>
+            </w:r>
+            <w:r>
+              <w:rPr>
+                <w:rFonts w:eastAsia="標楷體"/>
+              </w:rPr>
+              <w:t xml:space="preserve"> Warning: Profile has no rules. Profile is valid but will produce no </w:t>
+            </w:r>
+            <w:r>
+              <w:rPr>
+                <w:rFonts w:eastAsia="標楷體"/>
+              </w:rPr>
               <w:lastRenderedPageBreak/>
-              <w:t xml:space="preserve">5a. &lt;file.yaml&gt; </w:t>
-            </w:r>
-            <w:r>
-              <w:rPr>
-                <w:rFonts w:eastAsia="標楷體"/>
-              </w:rPr>
-              <w:t>不存在：系統輸出</w:t>
-            </w:r>
-            <w:r>
-              <w:rPr>
-                <w:rFonts w:eastAsia="標楷體"/>
-              </w:rPr>
-              <w:t xml:space="preserve"> Error: file not found &lt;path&gt;</w:t>
-            </w:r>
-            <w:r>
-              <w:rPr>
-                <w:rFonts w:eastAsia="標楷體"/>
-              </w:rPr>
-              <w:t>，終止</w:t>
-            </w:r>
-          </w:p>
-          <w:p>
-            <w:pPr>
-              <w:spacing w:before="40"/>
-              <w:rPr>
-                <w:rFonts w:eastAsia="標楷體"/>
-              </w:rPr>
-            </w:pPr>
-            <w:r>
-              <w:rPr>
-                <w:rFonts w:eastAsia="標楷體"/>
-              </w:rPr>
-              <w:t xml:space="preserve">6a. YAML </w:t>
-            </w:r>
-            <w:r>
-              <w:rPr>
-                <w:rFonts w:eastAsia="標楷體"/>
-              </w:rPr>
-              <w:t>頂層結構錯誤（不是合法的</w:t>
-            </w:r>
-            <w:r>
-              <w:rPr>
-                <w:rFonts w:eastAsia="標楷體"/>
-              </w:rPr>
-              <w:t xml:space="preserve"> YAML mapping</w:t>
-            </w:r>
-            <w:r>
-              <w:rPr>
-                <w:rFonts w:eastAsia="標楷體"/>
-              </w:rPr>
-              <w:t>）：系統輸出</w:t>
-            </w:r>
-            <w:r>
-              <w:rPr>
-                <w:rFonts w:eastAsia="標楷體"/>
-              </w:rPr>
-              <w:t xml:space="preserve"> Invalid YAML structure </w:t>
-            </w:r>
-            <w:r>
-              <w:rPr>
-                <w:rFonts w:eastAsia="標楷體"/>
-              </w:rPr>
-              <w:t>與錯誤行號，終止</w:t>
-            </w:r>
-          </w:p>
-          <w:p>
-            <w:pPr>
-              <w:spacing w:before="40"/>
-              <w:rPr>
-                <w:rFonts w:eastAsia="標楷體"/>
-              </w:rPr>
-            </w:pPr>
-            <w:r>
-              <w:rPr>
-                <w:rFonts w:eastAsia="標楷體"/>
-              </w:rPr>
-              <w:t xml:space="preserve">6b. </w:t>
-            </w:r>
-            <w:r>
-              <w:rPr>
-                <w:rFonts w:eastAsia="標楷體"/>
-              </w:rPr>
-              <w:t>遇到未知的</w:t>
-            </w:r>
-            <w:r>
-              <w:rPr>
-                <w:rFonts w:eastAsia="標楷體"/>
-              </w:rPr>
-              <w:t xml:space="preserve"> rule type</w:t>
-            </w:r>
-            <w:r>
-              <w:rPr>
-                <w:rFonts w:eastAsia="標楷體"/>
-              </w:rPr>
-              <w:t>：系統輸出</w:t>
-            </w:r>
-            <w:r>
-              <w:rPr>
-                <w:rFonts w:eastAsia="標楷體"/>
-              </w:rPr>
-              <w:t xml:space="preserve"> Unknown rule type: &lt;type&gt;. Allowed: NamingRule, DependencyRule, SupertypeRule, PackageRule</w:t>
-            </w:r>
-            <w:r>
-              <w:rPr>
-                <w:rFonts w:eastAsia="標楷體"/>
-              </w:rPr>
-              <w:t>，終止</w:t>
-            </w:r>
-          </w:p>
-          <w:p>
-            <w:pPr>
-              <w:spacing w:before="40"/>
-              <w:rPr>
-                <w:rFonts w:eastAsia="標楷體"/>
-              </w:rPr>
-            </w:pPr>
-            <w:r>
-              <w:rPr>
-                <w:rFonts w:eastAsia="標楷體"/>
-              </w:rPr>
-              <w:t xml:space="preserve">7a. package pattern </w:t>
-            </w:r>
-            <w:r>
-              <w:rPr>
-                <w:rFonts w:eastAsia="標楷體"/>
-              </w:rPr>
-              <w:t>含非法字元：系統輸出</w:t>
-            </w:r>
-            <w:r>
-              <w:rPr>
-                <w:rFonts w:eastAsia="標楷體"/>
-              </w:rPr>
-              <w:t xml:space="preserve"> Invalid package pattern: &lt;pattern&gt;</w:t>
-            </w:r>
-            <w:r>
-              <w:rPr>
-                <w:rFonts w:eastAsia="標楷體"/>
-              </w:rPr>
-              <w:t>，終止</w:t>
-            </w:r>
-          </w:p>
-          <w:p>
-            <w:pPr>
-              <w:spacing w:before="40"/>
-              <w:rPr>
-                <w:rFonts w:eastAsia="標楷體"/>
-              </w:rPr>
-            </w:pPr>
-            <w:r>
-              <w:rPr>
-                <w:rFonts w:eastAsia="標楷體"/>
-              </w:rPr>
-              <w:t xml:space="preserve">8a. YAML </w:t>
-            </w:r>
-            <w:r>
-              <w:rPr>
-                <w:rFonts w:eastAsia="標楷體"/>
-              </w:rPr>
-              <w:t>格式正確但</w:t>
-            </w:r>
-            <w:r>
-              <w:rPr>
-                <w:rFonts w:eastAsia="標楷體"/>
-              </w:rPr>
-              <w:t xml:space="preserve"> rules </w:t>
-            </w:r>
-            <w:r>
-              <w:rPr>
-                <w:rFonts w:eastAsia="標楷體"/>
-              </w:rPr>
-              <w:t>清單為空：系統輸出</w:t>
-            </w:r>
-            <w:r>
-              <w:rPr>
-                <w:rFonts w:eastAsia="標楷體"/>
-              </w:rPr>
-              <w:t xml:space="preserve"> Warning: Profile has no rules. Profile is valid but will produce no violations.</w:t>
+              <w:t>violations.</w:t>
             </w:r>
             <w:r>
               <w:rPr>
@@ -6958,43 +7273,7 @@
               <w:rPr>
                 <w:rFonts w:eastAsia="標楷體"/>
               </w:rPr>
-              <w:t>）：新增</w:t>
-            </w:r>
-            <w:r>
-              <w:rPr>
-                <w:rFonts w:eastAsia="標楷體"/>
-              </w:rPr>
-              <w:t xml:space="preserve"> rule type </w:t>
-            </w:r>
-            <w:r>
-              <w:rPr>
-                <w:rFonts w:eastAsia="標楷體"/>
-              </w:rPr>
-              <w:t>不需修改</w:t>
-            </w:r>
-            <w:r>
-              <w:rPr>
-                <w:rFonts w:eastAsia="標楷體"/>
-              </w:rPr>
-              <w:t xml:space="preserve"> ProfileValidator </w:t>
-            </w:r>
-            <w:r>
-              <w:rPr>
-                <w:rFonts w:eastAsia="標楷體"/>
-              </w:rPr>
-              <w:t>核心邏輯（</w:t>
-            </w:r>
-            <w:r>
-              <w:rPr>
-                <w:rFonts w:eastAsia="標楷體"/>
-              </w:rPr>
-              <w:t>Open/Closed Principle</w:t>
-            </w:r>
-            <w:r>
-              <w:rPr>
-                <w:rFonts w:eastAsia="標楷體"/>
-              </w:rPr>
-              <w:t>）</w:t>
+              <w:t>）：擴充新的規則類型不應影響現有規則的合規檢查行為</w:t>
             </w:r>
           </w:p>
         </w:tc>
@@ -7084,7 +7363,21 @@
               <w:rPr>
                 <w:rFonts w:eastAsia="標楷體"/>
               </w:rPr>
-              <w:t xml:space="preserve"> SnakeYAML </w:t>
+              <w:t xml:space="preserve"> </w:t>
+            </w:r>
+            <w:proofErr w:type="spellStart"/>
+            <w:r>
+              <w:rPr>
+                <w:rFonts w:eastAsia="標楷體"/>
+              </w:rPr>
+              <w:t>SnakeYAML</w:t>
+            </w:r>
+            <w:proofErr w:type="spellEnd"/>
+            <w:r>
+              <w:rPr>
+                <w:rFonts w:eastAsia="標楷體"/>
+              </w:rPr>
+              <w:t xml:space="preserve"> </w:t>
             </w:r>
             <w:r>
               <w:rPr>
@@ -7402,7 +7695,21 @@
               <w:rPr>
                 <w:rFonts w:eastAsia="標楷體"/>
               </w:rPr>
-              <w:t>extends: &lt;other-yaml-path&gt;</w:t>
+              <w:t>extends: &lt;other-</w:t>
+            </w:r>
+            <w:proofErr w:type="spellStart"/>
+            <w:r>
+              <w:rPr>
+                <w:rFonts w:eastAsia="標楷體"/>
+              </w:rPr>
+              <w:t>yaml</w:t>
+            </w:r>
+            <w:proofErr w:type="spellEnd"/>
+            <w:r>
+              <w:rPr>
+                <w:rFonts w:eastAsia="標楷體"/>
+              </w:rPr>
+              <w:t>-path&gt;</w:t>
             </w:r>
             <w:r>
               <w:rPr>
@@ -7881,14 +8188,7 @@
               <w:rPr>
                 <w:rFonts w:eastAsia="標楷體"/>
               </w:rPr>
-              <w:t>，希望系統提供可操作的修復建議，而不只是列出錯</w:t>
-            </w:r>
-            <w:r>
-              <w:rPr>
-                <w:rFonts w:eastAsia="標楷體"/>
-              </w:rPr>
-              <w:lastRenderedPageBreak/>
-              <w:t>誤清單。</w:t>
+              <w:t>，希望系統提供可操作的修復建議，而不只是列出錯誤清單。</w:t>
             </w:r>
           </w:p>
           <w:p>
@@ -8201,8 +8501,16 @@
               <w:rPr>
                 <w:rFonts w:eastAsia="標楷體"/>
               </w:rPr>
-              <w:t xml:space="preserve"> .arch-checker-suppress.yaml</w:t>
-            </w:r>
+              <w:t xml:space="preserve"> .arch-checker-</w:t>
+            </w:r>
+            <w:proofErr w:type="spellStart"/>
+            <w:r>
+              <w:rPr>
+                <w:rFonts w:eastAsia="標楷體"/>
+              </w:rPr>
+              <w:t>suppress.yaml</w:t>
+            </w:r>
+            <w:proofErr w:type="spellEnd"/>
             <w:r>
               <w:rPr>
                 <w:rFonts w:eastAsia="標楷體"/>
@@ -8237,7 +8545,21 @@
               <w:rPr>
                 <w:rFonts w:eastAsia="標楷體"/>
               </w:rPr>
-              <w:t xml:space="preserve"> ComplianceReport </w:t>
+              <w:t xml:space="preserve"> </w:t>
+            </w:r>
+            <w:proofErr w:type="spellStart"/>
+            <w:r>
+              <w:rPr>
+                <w:rFonts w:eastAsia="標楷體"/>
+              </w:rPr>
+              <w:t>ComplianceReport</w:t>
+            </w:r>
+            <w:proofErr w:type="spellEnd"/>
+            <w:r>
+              <w:rPr>
+                <w:rFonts w:eastAsia="標楷體"/>
+              </w:rPr>
+              <w:t xml:space="preserve"> </w:t>
             </w:r>
             <w:r>
               <w:rPr>
@@ -8321,7 +8643,21 @@
               <w:rPr>
                 <w:rFonts w:eastAsia="標楷體"/>
               </w:rPr>
-              <w:t xml:space="preserve"> arch-checker check --interactive --profile &lt;yaml-path&gt; &lt;project-path&gt;</w:t>
+              <w:t xml:space="preserve"> arch-checker check --interactive --profile &lt;</w:t>
+            </w:r>
+            <w:proofErr w:type="spellStart"/>
+            <w:r>
+              <w:rPr>
+                <w:rFonts w:eastAsia="標楷體"/>
+              </w:rPr>
+              <w:t>yaml</w:t>
+            </w:r>
+            <w:proofErr w:type="spellEnd"/>
+            <w:r>
+              <w:rPr>
+                <w:rFonts w:eastAsia="標楷體"/>
+              </w:rPr>
+              <w:t>-path&gt; &lt;project-path&gt;</w:t>
             </w:r>
           </w:p>
           <w:p>
@@ -8409,7 +8745,21 @@
               <w:rPr>
                 <w:rFonts w:eastAsia="標楷體"/>
               </w:rPr>
-              <w:t xml:space="preserve"> ArchitectureConstraint ID </w:t>
+              <w:t xml:space="preserve"> </w:t>
+            </w:r>
+            <w:proofErr w:type="spellStart"/>
+            <w:r>
+              <w:rPr>
+                <w:rFonts w:eastAsia="標楷體"/>
+              </w:rPr>
+              <w:t>ArchitectureConstraint</w:t>
+            </w:r>
+            <w:proofErr w:type="spellEnd"/>
+            <w:r>
+              <w:rPr>
+                <w:rFonts w:eastAsia="標楷體"/>
+              </w:rPr>
+              <w:t xml:space="preserve"> ID </w:t>
             </w:r>
             <w:r>
               <w:rPr>
@@ -8417,12 +8767,14 @@
               </w:rPr>
               <w:t>與說明、</w:t>
             </w:r>
+            <w:proofErr w:type="spellStart"/>
             <w:r>
               <w:rPr>
                 <w:rFonts w:eastAsia="標楷體"/>
               </w:rPr>
               <w:t>RefactoringSuggestion</w:t>
             </w:r>
+            <w:proofErr w:type="spellEnd"/>
             <w:r>
               <w:rPr>
                 <w:rFonts w:eastAsia="標楷體"/>
@@ -8515,8 +8867,16 @@
               <w:rPr>
                 <w:rFonts w:eastAsia="標楷體"/>
               </w:rPr>
-              <w:t xml:space="preserve"> .arch-checker-suppress.yaml</w:t>
-            </w:r>
+              <w:t xml:space="preserve"> .arch-checker-</w:t>
+            </w:r>
+            <w:proofErr w:type="spellStart"/>
+            <w:r>
+              <w:rPr>
+                <w:rFonts w:eastAsia="標楷體"/>
+              </w:rPr>
+              <w:t>suppress.yaml</w:t>
+            </w:r>
+            <w:proofErr w:type="spellEnd"/>
           </w:p>
           <w:p>
             <w:pPr>
@@ -8597,8 +8957,16 @@
               <w:rPr>
                 <w:rFonts w:eastAsia="標楷體"/>
               </w:rPr>
-              <w:t xml:space="preserve"> ComplianceReport</w:t>
-            </w:r>
+              <w:t xml:space="preserve"> </w:t>
+            </w:r>
+            <w:proofErr w:type="spellStart"/>
+            <w:r>
+              <w:rPr>
+                <w:rFonts w:eastAsia="標楷體"/>
+              </w:rPr>
+              <w:t>ComplianceReport</w:t>
+            </w:r>
+            <w:proofErr w:type="spellEnd"/>
             <w:r>
               <w:rPr>
                 <w:rFonts w:eastAsia="標楷體"/>
@@ -8785,8 +9153,16 @@
               <w:rPr>
                 <w:rFonts w:eastAsia="標楷體"/>
               </w:rPr>
-              <w:t xml:space="preserve"> RefactoringSuggestion</w:t>
-            </w:r>
+              <w:t xml:space="preserve"> </w:t>
+            </w:r>
+            <w:proofErr w:type="spellStart"/>
+            <w:r>
+              <w:rPr>
+                <w:rFonts w:eastAsia="標楷體"/>
+              </w:rPr>
+              <w:t>RefactoringSuggestion</w:t>
+            </w:r>
+            <w:proofErr w:type="spellEnd"/>
             <w:r>
               <w:rPr>
                 <w:rFonts w:eastAsia="標楷體"/>
@@ -8973,6 +9349,7 @@
               <w:rPr>
                 <w:rFonts w:eastAsia="標楷體"/>
               </w:rPr>
+              <w:lastRenderedPageBreak/>
               <w:t xml:space="preserve">5c. Developer </w:t>
             </w:r>
             <w:r>
@@ -9065,7 +9442,14 @@
               <w:rPr>
                 <w:rFonts w:eastAsia="標楷體"/>
               </w:rPr>
-              <w:t xml:space="preserve"> All checks passed (N violations suppressed)</w:t>
+              <w:t xml:space="preserve"> All checks passed (N violations </w:t>
+            </w:r>
+            <w:proofErr w:type="gramStart"/>
+            <w:r>
+              <w:rPr>
+                <w:rFonts w:eastAsia="標楷體"/>
+              </w:rPr>
+              <w:t>suppressed)</w:t>
             </w:r>
             <w:r>
               <w:rPr>
@@ -9073,6 +9457,7 @@
               </w:rPr>
               <w:t>，</w:t>
             </w:r>
+            <w:proofErr w:type="gramEnd"/>
             <w:r>
               <w:rPr>
                 <w:rFonts w:eastAsia="標楷體"/>
@@ -9218,7 +9603,19 @@
               <w:rPr>
                 <w:rFonts w:eastAsia="標楷體"/>
               </w:rPr>
-              <w:t>）：互動流程必須可在不啟動完整</w:t>
+              <w:t>）：互動流程的合規性檢查邏輯必須可透過</w:t>
+            </w:r>
+            <w:r>
+              <w:rPr>
+                <w:rFonts w:eastAsia="標楷體"/>
+              </w:rPr>
+              <w:t xml:space="preserve"> unit test </w:t>
+            </w:r>
+            <w:r>
+              <w:rPr>
+                <w:rFonts w:eastAsia="標楷體"/>
+              </w:rPr>
+              <w:t>獨立驗證，不依賴完整的</w:t>
             </w:r>
             <w:r>
               <w:rPr>
@@ -9230,43 +9627,7 @@
               <w:rPr>
                 <w:rFonts w:eastAsia="標楷體"/>
               </w:rPr>
-              <w:t>的情況下以</w:t>
-            </w:r>
-            <w:r>
-              <w:rPr>
-                <w:rFonts w:eastAsia="標楷體"/>
-              </w:rPr>
-              <w:t xml:space="preserve"> unit test </w:t>
-            </w:r>
-            <w:r>
-              <w:rPr>
-                <w:rFonts w:eastAsia="標楷體"/>
-              </w:rPr>
-              <w:t>驗證（</w:t>
-            </w:r>
-            <w:r>
-              <w:rPr>
-                <w:rFonts w:eastAsia="標楷體"/>
-              </w:rPr>
-              <w:t xml:space="preserve">I/O </w:t>
-            </w:r>
-            <w:r>
-              <w:rPr>
-                <w:rFonts w:eastAsia="標楷體"/>
-              </w:rPr>
-              <w:t>需可</w:t>
-            </w:r>
-            <w:r>
-              <w:rPr>
-                <w:rFonts w:eastAsia="標楷體"/>
-              </w:rPr>
-              <w:t xml:space="preserve"> mock</w:t>
-            </w:r>
-            <w:r>
-              <w:rPr>
-                <w:rFonts w:eastAsia="標楷體"/>
-              </w:rPr>
-              <w:t>）</w:t>
+              <w:t>環境</w:t>
             </w:r>
           </w:p>
         </w:tc>
@@ -9334,6 +9695,7 @@
               </w:rPr>
               <w:t xml:space="preserve">*a. Suppression </w:t>
             </w:r>
+            <w:proofErr w:type="gramStart"/>
             <w:r>
               <w:rPr>
                 <w:rFonts w:eastAsia="標楷體"/>
@@ -9344,8 +9706,25 @@
               <w:rPr>
                 <w:rFonts w:eastAsia="標楷體"/>
               </w:rPr>
-              <w:t xml:space="preserve"> .arch-checker-suppress.yaml</w:t>
-            </w:r>
+              <w:t xml:space="preserve"> .arch</w:t>
+            </w:r>
+            <w:proofErr w:type="gramEnd"/>
+            <w:r>
+              <w:rPr>
+                <w:rFonts w:eastAsia="標楷體"/>
+              </w:rPr>
+              <w:t>-checker-</w:t>
+            </w:r>
+            <w:proofErr w:type="spellStart"/>
+            <w:proofErr w:type="gramStart"/>
+            <w:r>
+              <w:rPr>
+                <w:rFonts w:eastAsia="標楷體"/>
+              </w:rPr>
+              <w:t>suppress.yaml</w:t>
+            </w:r>
+            <w:proofErr w:type="spellEnd"/>
+            <w:proofErr w:type="gramEnd"/>
             <w:r>
               <w:rPr>
                 <w:rFonts w:eastAsia="標楷體"/>
@@ -9426,11 +9805,19 @@
               </w:rPr>
               <w:t>、</w:t>
             </w:r>
-            <w:r>
-              <w:rPr>
-                <w:rFonts w:eastAsia="標楷體"/>
-              </w:rPr>
-              <w:t xml:space="preserve">Yes </w:t>
+            <w:proofErr w:type="gramStart"/>
+            <w:r>
+              <w:rPr>
+                <w:rFonts w:eastAsia="標楷體"/>
+              </w:rPr>
+              <w:t>Yes</w:t>
+            </w:r>
+            <w:proofErr w:type="gramEnd"/>
+            <w:r>
+              <w:rPr>
+                <w:rFonts w:eastAsia="標楷體"/>
+              </w:rPr>
+              <w:t xml:space="preserve"> </w:t>
             </w:r>
             <w:r>
               <w:rPr>
@@ -9462,7 +9849,21 @@
               <w:rPr>
                 <w:rFonts w:eastAsia="標楷體"/>
               </w:rPr>
-              <w:t xml:space="preserve"> stdout </w:t>
+              <w:t xml:space="preserve"> </w:t>
+            </w:r>
+            <w:proofErr w:type="spellStart"/>
+            <w:r>
+              <w:rPr>
+                <w:rFonts w:eastAsia="標楷體"/>
+              </w:rPr>
+              <w:t>stdout</w:t>
+            </w:r>
+            <w:proofErr w:type="spellEnd"/>
+            <w:r>
+              <w:rPr>
+                <w:rFonts w:eastAsia="標楷體"/>
+              </w:rPr>
+              <w:t xml:space="preserve"> </w:t>
             </w:r>
             <w:r>
               <w:rPr>
@@ -9819,8 +10220,16 @@
         <w:rPr>
           <w:rFonts w:eastAsia="標楷體"/>
         </w:rPr>
-        <w:t xml:space="preserve"> .arch-checker-suppress.yaml</w:t>
+        <w:t xml:space="preserve"> .arch-checker-</w:t>
       </w:r>
+      <w:proofErr w:type="spellStart"/>
+      <w:r>
+        <w:rPr>
+          <w:rFonts w:eastAsia="標楷體"/>
+        </w:rPr>
+        <w:t>suppress.yaml</w:t>
+      </w:r>
+      <w:proofErr w:type="spellEnd"/>
       <w:r>
         <w:rPr>
           <w:rFonts w:eastAsia="標楷體"/>
@@ -9925,7 +10334,21 @@
         <w:rPr>
           <w:rFonts w:eastAsia="標楷體"/>
         </w:rPr>
-        <w:t xml:space="preserve"> --profile &lt;yaml-path&gt; </w:t>
+        <w:t xml:space="preserve"> --profile &lt;</w:t>
+      </w:r>
+      <w:proofErr w:type="spellStart"/>
+      <w:r>
+        <w:rPr>
+          <w:rFonts w:eastAsia="標楷體"/>
+        </w:rPr>
+        <w:t>yaml</w:t>
+      </w:r>
+      <w:proofErr w:type="spellEnd"/>
+      <w:r>
+        <w:rPr>
+          <w:rFonts w:eastAsia="標楷體"/>
+        </w:rPr>
+        <w:t xml:space="preserve">-path&gt; </w:t>
       </w:r>
       <w:r>
         <w:rPr>
@@ -9949,7 +10372,21 @@
         <w:rPr>
           <w:rFonts w:eastAsia="標楷體"/>
         </w:rPr>
-        <w:t xml:space="preserve"> ProfileLoader </w:t>
+        <w:t xml:space="preserve"> </w:t>
+      </w:r>
+      <w:proofErr w:type="spellStart"/>
+      <w:r>
+        <w:rPr>
+          <w:rFonts w:eastAsia="標楷體"/>
+        </w:rPr>
+        <w:t>ProfileLoader</w:t>
+      </w:r>
+      <w:proofErr w:type="spellEnd"/>
+      <w:r>
+        <w:rPr>
+          <w:rFonts w:eastAsia="標楷體"/>
+        </w:rPr>
+        <w:t xml:space="preserve"> </w:t>
       </w:r>
       <w:r>
         <w:rPr>
@@ -9961,7 +10398,21 @@
         <w:rPr>
           <w:rFonts w:eastAsia="標楷體"/>
         </w:rPr>
-        <w:t xml:space="preserve"> ProfileValidator </w:t>
+        <w:t xml:space="preserve"> </w:t>
+      </w:r>
+      <w:proofErr w:type="spellStart"/>
+      <w:r>
+        <w:rPr>
+          <w:rFonts w:eastAsia="標楷體"/>
+        </w:rPr>
+        <w:t>ProfileValidator</w:t>
+      </w:r>
+      <w:proofErr w:type="spellEnd"/>
+      <w:r>
+        <w:rPr>
+          <w:rFonts w:eastAsia="標楷體"/>
+        </w:rPr>
+        <w:t xml:space="preserve"> </w:t>
       </w:r>
       <w:r>
         <w:rPr>
@@ -10627,55 +11078,7 @@
               <w:rPr>
                 <w:rFonts w:eastAsia="標楷體"/>
               </w:rPr>
-              <w:t>新增</w:t>
-            </w:r>
-            <w:r>
-              <w:rPr>
-                <w:rFonts w:eastAsia="標楷體"/>
-              </w:rPr>
-              <w:t xml:space="preserve"> ConstraintChecker </w:t>
-            </w:r>
-            <w:r>
-              <w:rPr>
-                <w:rFonts w:eastAsia="標楷體"/>
-              </w:rPr>
-              <w:t>子類別不需修改</w:t>
-            </w:r>
-            <w:r>
-              <w:rPr>
-                <w:rFonts w:eastAsia="標楷體"/>
-              </w:rPr>
-              <w:t xml:space="preserve"> ArchChecker </w:t>
-            </w:r>
-            <w:r>
-              <w:rPr>
-                <w:rFonts w:eastAsia="標楷體"/>
-              </w:rPr>
-              <w:t>或</w:t>
-            </w:r>
-            <w:r>
-              <w:rPr>
-                <w:rFonts w:eastAsia="標楷體"/>
-              </w:rPr>
-              <w:t xml:space="preserve"> StyleProfile</w:t>
-            </w:r>
-            <w:r>
-              <w:rPr>
-                <w:rFonts w:eastAsia="標楷體"/>
-              </w:rPr>
-              <w:t>（</w:t>
-            </w:r>
-            <w:r>
-              <w:rPr>
-                <w:rFonts w:eastAsia="標楷體"/>
-              </w:rPr>
-              <w:t>Open/Closed Principle</w:t>
-            </w:r>
-            <w:r>
-              <w:rPr>
-                <w:rFonts w:eastAsia="標楷體"/>
-              </w:rPr>
-              <w:t>）</w:t>
+              <w:t>系統應支援在不修改既有合規檢查流程的前提下，擴充對新架構規則類型的支援</w:t>
             </w:r>
           </w:p>
         </w:tc>
@@ -10919,19 +11322,19 @@
               <w:rPr>
                 <w:rFonts w:eastAsia="標楷體"/>
               </w:rPr>
-              <w:t>每個</w:t>
-            </w:r>
-            <w:r>
-              <w:rPr>
-                <w:rFonts w:eastAsia="標楷體"/>
-              </w:rPr>
-              <w:t xml:space="preserve"> ConstraintChecker </w:t>
-            </w:r>
-            <w:r>
-              <w:rPr>
-                <w:rFonts w:eastAsia="標楷體"/>
-              </w:rPr>
-              <w:t>子類別必須可在不啟動完整</w:t>
+              <w:t>每個架構規則的合規性檢查邏輯必須可透過</w:t>
+            </w:r>
+            <w:r>
+              <w:rPr>
+                <w:rFonts w:eastAsia="標楷體"/>
+              </w:rPr>
+              <w:t xml:space="preserve"> unit test </w:t>
+            </w:r>
+            <w:r>
+              <w:rPr>
+                <w:rFonts w:eastAsia="標楷體"/>
+              </w:rPr>
+              <w:t>獨立驗證，不依賴完整的</w:t>
             </w:r>
             <w:r>
               <w:rPr>
@@ -10943,13 +11346,7 @@
               <w:rPr>
                 <w:rFonts w:eastAsia="標楷體"/>
               </w:rPr>
-              <w:t>的情況下獨立進行</w:t>
-            </w:r>
-            <w:r>
-              <w:rPr>
-                <w:rFonts w:eastAsia="標楷體"/>
-              </w:rPr>
-              <w:t xml:space="preserve"> unit test</w:t>
+              <w:t>環境</w:t>
             </w:r>
           </w:p>
         </w:tc>
@@ -11177,12 +11574,14 @@
                 <w:rFonts w:eastAsia="標楷體"/>
               </w:rPr>
             </w:pPr>
+            <w:proofErr w:type="spellStart"/>
             <w:r>
               <w:rPr>
                 <w:rFonts w:eastAsia="標楷體"/>
               </w:rPr>
               <w:t>ArchitectureConstraint</w:t>
             </w:r>
+            <w:proofErr w:type="spellEnd"/>
           </w:p>
         </w:tc>
         <w:tc>
@@ -11223,43 +11622,63 @@
               <w:rPr>
                 <w:rFonts w:eastAsia="標楷體"/>
               </w:rPr>
-              <w:t xml:space="preserve"> NamingRule</w:t>
-            </w:r>
+              <w:t xml:space="preserve"> </w:t>
+            </w:r>
+            <w:proofErr w:type="spellStart"/>
+            <w:r>
+              <w:rPr>
+                <w:rFonts w:eastAsia="標楷體"/>
+              </w:rPr>
+              <w:t>NamingRule</w:t>
+            </w:r>
+            <w:proofErr w:type="spellEnd"/>
             <w:r>
               <w:rPr>
                 <w:rFonts w:eastAsia="標楷體"/>
               </w:rPr>
               <w:t>、</w:t>
             </w:r>
+            <w:proofErr w:type="spellStart"/>
             <w:r>
               <w:rPr>
                 <w:rFonts w:eastAsia="標楷體"/>
               </w:rPr>
               <w:t>DependencyRule</w:t>
             </w:r>
+            <w:proofErr w:type="spellEnd"/>
             <w:r>
               <w:rPr>
                 <w:rFonts w:eastAsia="標楷體"/>
               </w:rPr>
               <w:t>、</w:t>
             </w:r>
+            <w:proofErr w:type="spellStart"/>
             <w:r>
               <w:rPr>
                 <w:rFonts w:eastAsia="標楷體"/>
               </w:rPr>
               <w:t>SupertypeRule</w:t>
             </w:r>
+            <w:proofErr w:type="spellEnd"/>
             <w:r>
               <w:rPr>
                 <w:rFonts w:eastAsia="標楷體"/>
               </w:rPr>
               <w:t>、</w:t>
             </w:r>
-            <w:r>
-              <w:rPr>
-                <w:rFonts w:eastAsia="標楷體"/>
-              </w:rPr>
-              <w:t xml:space="preserve">PackageRule </w:t>
+            <w:proofErr w:type="spellStart"/>
+            <w:r>
+              <w:rPr>
+                <w:rFonts w:eastAsia="標楷體"/>
+              </w:rPr>
+              <w:t>PackageRule</w:t>
+            </w:r>
+            <w:proofErr w:type="spellEnd"/>
+            <w:r>
+              <w:rPr>
+                <w:rFonts w:eastAsia="標楷體"/>
+              </w:rPr>
+              <w:t xml:space="preserve"> </w:t>
             </w:r>
             <w:r>
               <w:rPr>
@@ -11293,12 +11712,14 @@
                 <w:rFonts w:eastAsia="標楷體"/>
               </w:rPr>
             </w:pPr>
+            <w:proofErr w:type="spellStart"/>
             <w:r>
               <w:rPr>
                 <w:rFonts w:eastAsia="標楷體"/>
               </w:rPr>
               <w:t>SupertypeRule</w:t>
             </w:r>
+            <w:proofErr w:type="spellEnd"/>
           </w:p>
         </w:tc>
         <w:tc>
@@ -11333,8 +11754,16 @@
               <w:rPr>
                 <w:rFonts w:eastAsia="標楷體"/>
               </w:rPr>
-              <w:t xml:space="preserve"> ArchitectureConstraint</w:t>
-            </w:r>
+              <w:t xml:space="preserve"> </w:t>
+            </w:r>
+            <w:proofErr w:type="spellStart"/>
+            <w:r>
+              <w:rPr>
+                <w:rFonts w:eastAsia="標楷體"/>
+              </w:rPr>
+              <w:t>ArchitectureConstraint</w:t>
+            </w:r>
+            <w:proofErr w:type="spellEnd"/>
             <w:r>
               <w:rPr>
                 <w:rFonts w:eastAsia="標楷體"/>
@@ -11531,12 +11960,14 @@
                 <w:rFonts w:eastAsia="標楷體"/>
               </w:rPr>
             </w:pPr>
+            <w:proofErr w:type="spellStart"/>
             <w:r>
               <w:rPr>
                 <w:rFonts w:eastAsia="標楷體"/>
               </w:rPr>
               <w:t>ViolationReport</w:t>
             </w:r>
+            <w:proofErr w:type="spellEnd"/>
           </w:p>
         </w:tc>
         <w:tc>
@@ -11627,6 +12058,7 @@
               <w:rPr>
                 <w:rFonts w:eastAsia="標楷體"/>
               </w:rPr>
+              <w:lastRenderedPageBreak/>
               <w:t>AST (Abstract Syntax Tree)</w:t>
             </w:r>
           </w:p>
@@ -11669,7 +12101,21 @@
               <w:rPr>
                 <w:rFonts w:eastAsia="標楷體"/>
               </w:rPr>
-              <w:t xml:space="preserve"> JavaParser </w:t>
+              <w:t xml:space="preserve"> </w:t>
+            </w:r>
+            <w:proofErr w:type="spellStart"/>
+            <w:r>
+              <w:rPr>
+                <w:rFonts w:eastAsia="標楷體"/>
+              </w:rPr>
+              <w:t>JavaParser</w:t>
+            </w:r>
+            <w:proofErr w:type="spellEnd"/>
+            <w:r>
+              <w:rPr>
+                <w:rFonts w:eastAsia="標楷體"/>
+              </w:rPr>
+              <w:t xml:space="preserve"> </w:t>
             </w:r>
             <w:r>
               <w:rPr>
@@ -11681,7 +12127,21 @@
               <w:rPr>
                 <w:rFonts w:eastAsia="標楷體"/>
               </w:rPr>
-              <w:t xml:space="preserve"> ConstraintChecker </w:t>
+              <w:t xml:space="preserve"> </w:t>
+            </w:r>
+            <w:proofErr w:type="spellStart"/>
+            <w:r>
+              <w:rPr>
+                <w:rFonts w:eastAsia="標楷體"/>
+              </w:rPr>
+              <w:t>ConstraintChecker</w:t>
+            </w:r>
+            <w:proofErr w:type="spellEnd"/>
+            <w:r>
+              <w:rPr>
+                <w:rFonts w:eastAsia="標楷體"/>
+              </w:rPr>
+              <w:t xml:space="preserve"> </w:t>
             </w:r>
             <w:r>
               <w:rPr>
@@ -11715,12 +12175,14 @@
                 <w:rFonts w:eastAsia="標楷體"/>
               </w:rPr>
             </w:pPr>
+            <w:proofErr w:type="spellStart"/>
             <w:r>
               <w:rPr>
                 <w:rFonts w:eastAsia="標楷體"/>
               </w:rPr>
               <w:t>CompilationUnit</w:t>
             </w:r>
+            <w:proofErr w:type="spellEnd"/>
           </w:p>
         </w:tc>
         <w:tc>
@@ -11745,11 +12207,19 @@
                 <w:rFonts w:eastAsia="標楷體"/>
               </w:rPr>
             </w:pPr>
-            <w:r>
-              <w:rPr>
-                <w:rFonts w:eastAsia="標楷體"/>
-              </w:rPr>
-              <w:t xml:space="preserve">JavaParser </w:t>
+            <w:proofErr w:type="spellStart"/>
+            <w:r>
+              <w:rPr>
+                <w:rFonts w:eastAsia="標楷體"/>
+              </w:rPr>
+              <w:t>JavaParser</w:t>
+            </w:r>
+            <w:proofErr w:type="spellEnd"/>
+            <w:r>
+              <w:rPr>
+                <w:rFonts w:eastAsia="標楷體"/>
+              </w:rPr>
+              <w:t xml:space="preserve"> </w:t>
             </w:r>
             <w:r>
               <w:rPr>
@@ -11873,7 +12343,6 @@
               <w:rPr>
                 <w:rFonts w:eastAsia="標楷體"/>
               </w:rPr>
-              <w:lastRenderedPageBreak/>
               <w:t>exit code</w:t>
             </w:r>
           </w:p>
@@ -12038,7 +12507,21 @@
               <w:rPr>
                 <w:rFonts w:eastAsia="標楷體"/>
               </w:rPr>
-              <w:t xml:space="preserve"> *.ui.*</w:t>
+              <w:t xml:space="preserve"> *.</w:t>
+            </w:r>
+            <w:proofErr w:type="spellStart"/>
+            <w:r>
+              <w:rPr>
+                <w:rFonts w:eastAsia="標楷體"/>
+              </w:rPr>
+              <w:t>ui</w:t>
+            </w:r>
+            <w:proofErr w:type="spellEnd"/>
+            <w:r>
+              <w:rPr>
+                <w:rFonts w:eastAsia="標楷體"/>
+              </w:rPr>
+              <w:t>.*</w:t>
             </w:r>
             <w:r>
               <w:rPr>
@@ -12309,24 +12792,6 @@
               <w:rPr>
                 <w:rFonts w:eastAsia="標楷體"/>
               </w:rPr>
-              <w:t>課程規定</w:t>
-            </w:r>
-            <w:r>
-              <w:rPr>
-                <w:rFonts w:eastAsia="標楷體"/>
-              </w:rPr>
-              <w:t xml:space="preserve"> OO </w:t>
-            </w:r>
-            <w:r>
-              <w:rPr>
-                <w:rFonts w:eastAsia="標楷體"/>
-              </w:rPr>
-              <w:t>語言；</w:t>
-            </w:r>
-            <w:r>
-              <w:rPr>
-                <w:rFonts w:eastAsia="標楷體"/>
-              </w:rPr>
               <w:t xml:space="preserve">LTS </w:t>
             </w:r>
             <w:r>
@@ -12391,11 +12856,19 @@
                 <w:rFonts w:eastAsia="標楷體"/>
               </w:rPr>
             </w:pPr>
-            <w:r>
-              <w:rPr>
-                <w:rFonts w:eastAsia="標楷體"/>
-              </w:rPr>
-              <w:t>JavaParser 3.x</w:t>
+            <w:proofErr w:type="spellStart"/>
+            <w:r>
+              <w:rPr>
+                <w:rFonts w:eastAsia="標楷體"/>
+              </w:rPr>
+              <w:t>JavaParser</w:t>
+            </w:r>
+            <w:proofErr w:type="spellEnd"/>
+            <w:r>
+              <w:rPr>
+                <w:rFonts w:eastAsia="標楷體"/>
+              </w:rPr>
+              <w:t xml:space="preserve"> 3.x</w:t>
             </w:r>
           </w:p>
         </w:tc>
@@ -12513,12 +12986,14 @@
                 <w:rFonts w:eastAsia="標楷體"/>
               </w:rPr>
             </w:pPr>
+            <w:proofErr w:type="spellStart"/>
             <w:r>
               <w:rPr>
                 <w:rFonts w:eastAsia="標楷體"/>
               </w:rPr>
               <w:t>picocli</w:t>
             </w:r>
+            <w:proofErr w:type="spellEnd"/>
           </w:p>
         </w:tc>
         <w:tc>
@@ -12633,7 +13108,21 @@
               <w:rPr>
                 <w:rFonts w:eastAsia="標楷體"/>
               </w:rPr>
-              <w:t>YAML (SnakeYAML)</w:t>
+              <w:t>YAML (</w:t>
+            </w:r>
+            <w:proofErr w:type="spellStart"/>
+            <w:r>
+              <w:rPr>
+                <w:rFonts w:eastAsia="標楷體"/>
+              </w:rPr>
+              <w:t>SnakeYAML</w:t>
+            </w:r>
+            <w:proofErr w:type="spellEnd"/>
+            <w:r>
+              <w:rPr>
+                <w:rFonts w:eastAsia="標楷體"/>
+              </w:rPr>
+              <w:t>)</w:t>
             </w:r>
           </w:p>
         </w:tc>
@@ -12663,7 +13152,7 @@
               <w:rPr>
                 <w:rFonts w:eastAsia="標楷體"/>
               </w:rPr>
-              <w:t>可讀性高，易於手工編輯</w:t>
+              <w:t>可讀性高，易於編輯</w:t>
             </w:r>
           </w:p>
         </w:tc>
@@ -12755,13 +13244,7 @@
               <w:rPr>
                 <w:rFonts w:eastAsia="標楷體"/>
               </w:rPr>
-              <w:t>課程要求</w:t>
-            </w:r>
-            <w:r>
-              <w:rPr>
-                <w:rFonts w:eastAsia="標楷體"/>
-              </w:rPr>
-              <w:t xml:space="preserve"> unit testing</w:t>
+              <w:t>unit testing</w:t>
             </w:r>
           </w:p>
         </w:tc>
@@ -13103,20 +13586,50 @@
           <w:p>
             <w:pPr>
               <w:rPr>
+                <w:rFonts w:eastAsia="標楷體"/>
+              </w:rPr>
+            </w:pPr>
+            <w:r>
+              <w:rPr>
                 <w:rFonts w:eastAsia="標楷體" w:hint="eastAsia"/>
               </w:rPr>
+              <w:t>113598009</w:t>
+            </w:r>
+          </w:p>
+        </w:tc>
+        <w:tc>
+          <w:tcPr>
+            <w:tcW w:w="1500" w:type="dxa"/>
+            <w:tcBorders>
+              <w:top w:val="single" w:sz="1" w:space="0" w:color="AAAAAA"/>
+              <w:left w:val="single" w:sz="1" w:space="0" w:color="AAAAAA"/>
+              <w:bottom w:val="single" w:sz="1" w:space="0" w:color="AAAAAA"/>
+              <w:right w:val="single" w:sz="1" w:space="0" w:color="AAAAAA"/>
+            </w:tcBorders>
+            <w:tcMar>
+              <w:top w:w="80" w:type="dxa"/>
+              <w:left w:w="120" w:type="dxa"/>
+              <w:bottom w:w="80" w:type="dxa"/>
+              <w:right w:w="120" w:type="dxa"/>
+            </w:tcMar>
+          </w:tcPr>
+          <w:p>
+            <w:pPr>
+              <w:rPr>
+                <w:rFonts w:eastAsia="標楷體"/>
+              </w:rPr>
             </w:pPr>
             <w:r>
               <w:rPr>
                 <w:rFonts w:eastAsia="標楷體" w:hint="eastAsia"/>
               </w:rPr>
-              <w:t>113598009</w:t>
-            </w:r>
-          </w:p>
-        </w:tc>
-        <w:tc>
-          <w:tcPr>
-            <w:tcW w:w="1500" w:type="dxa"/>
+              <w:t>李俊威</w:t>
+            </w:r>
+          </w:p>
+        </w:tc>
+        <w:tc>
+          <w:tcPr>
+            <w:tcW w:w="1200" w:type="dxa"/>
             <w:tcBorders>
               <w:top w:val="single" w:sz="1" w:space="0" w:color="AAAAAA"/>
               <w:left w:val="single" w:sz="1" w:space="0" w:color="AAAAAA"/>
@@ -13140,66 +13653,36 @@
               <w:rPr>
                 <w:rFonts w:eastAsia="標楷體" w:hint="eastAsia"/>
               </w:rPr>
-              <w:t>李俊威</w:t>
-            </w:r>
-          </w:p>
-        </w:tc>
-        <w:tc>
-          <w:tcPr>
-            <w:tcW w:w="1200" w:type="dxa"/>
-            <w:tcBorders>
-              <w:top w:val="single" w:sz="1" w:space="0" w:color="AAAAAA"/>
-              <w:left w:val="single" w:sz="1" w:space="0" w:color="AAAAAA"/>
-              <w:bottom w:val="single" w:sz="1" w:space="0" w:color="AAAAAA"/>
-              <w:right w:val="single" w:sz="1" w:space="0" w:color="AAAAAA"/>
-            </w:tcBorders>
-            <w:tcMar>
-              <w:top w:w="80" w:type="dxa"/>
-              <w:left w:w="120" w:type="dxa"/>
-              <w:bottom w:w="80" w:type="dxa"/>
-              <w:right w:w="120" w:type="dxa"/>
-            </w:tcMar>
-          </w:tcPr>
-          <w:p>
-            <w:pPr>
+              <w:t>HW#1</w:t>
+            </w:r>
+          </w:p>
+        </w:tc>
+        <w:tc>
+          <w:tcPr>
+            <w:tcW w:w="2526" w:type="dxa"/>
+            <w:tcBorders>
+              <w:top w:val="single" w:sz="1" w:space="0" w:color="AAAAAA"/>
+              <w:left w:val="single" w:sz="1" w:space="0" w:color="AAAAAA"/>
+              <w:bottom w:val="single" w:sz="1" w:space="0" w:color="AAAAAA"/>
+              <w:right w:val="single" w:sz="1" w:space="0" w:color="AAAAAA"/>
+            </w:tcBorders>
+            <w:tcMar>
+              <w:top w:w="80" w:type="dxa"/>
+              <w:left w:w="120" w:type="dxa"/>
+              <w:bottom w:w="80" w:type="dxa"/>
+              <w:right w:w="120" w:type="dxa"/>
+            </w:tcMar>
+          </w:tcPr>
+          <w:p>
+            <w:pPr>
+              <w:rPr>
+                <w:rFonts w:eastAsia="標楷體"/>
+              </w:rPr>
+            </w:pPr>
+            <w:r>
               <w:rPr>
                 <w:rFonts w:eastAsia="標楷體" w:hint="eastAsia"/>
               </w:rPr>
-            </w:pPr>
-            <w:r>
-              <w:rPr>
-                <w:rFonts w:eastAsia="標楷體" w:hint="eastAsia"/>
-              </w:rPr>
-              <w:t>HW#1</w:t>
-            </w:r>
-          </w:p>
-        </w:tc>
-        <w:tc>
-          <w:tcPr>
-            <w:tcW w:w="2526" w:type="dxa"/>
-            <w:tcBorders>
-              <w:top w:val="single" w:sz="1" w:space="0" w:color="AAAAAA"/>
-              <w:left w:val="single" w:sz="1" w:space="0" w:color="AAAAAA"/>
-              <w:bottom w:val="single" w:sz="1" w:space="0" w:color="AAAAAA"/>
-              <w:right w:val="single" w:sz="1" w:space="0" w:color="AAAAAA"/>
-            </w:tcBorders>
-            <w:tcMar>
-              <w:top w:w="80" w:type="dxa"/>
-              <w:left w:w="120" w:type="dxa"/>
-              <w:bottom w:w="80" w:type="dxa"/>
-              <w:right w:w="120" w:type="dxa"/>
-            </w:tcMar>
-          </w:tcPr>
-          <w:p>
-            <w:pPr>
-              <w:rPr>
-                <w:rFonts w:eastAsia="標楷體" w:hint="eastAsia"/>
-              </w:rPr>
-            </w:pPr>
-            <w:r>
-              <w:rPr>
-                <w:rFonts w:eastAsia="標楷體" w:hint="eastAsia"/>
-              </w:rPr>
               <w:t>115/03/03 15:00 ~ 18:00</w:t>
             </w:r>
           </w:p>
@@ -13223,7 +13706,7 @@
           <w:p>
             <w:pPr>
               <w:rPr>
-                <w:rFonts w:eastAsia="標楷體" w:hint="eastAsia"/>
+                <w:rFonts w:eastAsia="標楷體"/>
               </w:rPr>
             </w:pPr>
             <w:r>
@@ -13352,7 +13835,14 @@
               <w:rPr>
                 <w:rFonts w:eastAsia="標楷體"/>
               </w:rPr>
-              <w:t xml:space="preserve">115/03/12  </w:t>
+              <w:t>115/03/</w:t>
+            </w:r>
+            <w:proofErr w:type="gramStart"/>
+            <w:r>
+              <w:rPr>
+                <w:rFonts w:eastAsia="標楷體"/>
+              </w:rPr>
+              <w:t xml:space="preserve">12  </w:t>
             </w:r>
             <w:r>
               <w:rPr>
@@ -13372,6 +13862,7 @@
               </w:rPr>
               <w:t>00</w:t>
             </w:r>
+            <w:proofErr w:type="gramEnd"/>
             <w:r>
               <w:rPr>
                 <w:rFonts w:eastAsia="標楷體"/>
@@ -13424,7 +13915,7 @@
               <w:rPr>
                 <w:rFonts w:eastAsia="標楷體" w:hint="eastAsia"/>
               </w:rPr>
-              <w:t xml:space="preserve">6 </w:t>
+              <w:t>6</w:t>
             </w:r>
             <w:r>
               <w:rPr>

</xml_diff>